<commit_message>
Report the Part 2 TDD Evidence and TDD log table + recolor some texts.
</commit_message>
<xml_diff>
--- a/TangPiseth_Report.docx
+++ b/TangPiseth_Report.docx
@@ -5828,6 +5828,14 @@
                 <w:szCs w:val="18"/>
               </w:rPr>
             </w:pPr>
+            <w:r>
+              <w:rPr>
+                <w:rFonts w:ascii="Lora" w:hAnsi="Lora"/>
+                <w:sz w:val="18"/>
+                <w:szCs w:val="18"/>
+              </w:rPr>
+              <w:t>dcfd8a8</w:t>
+            </w:r>
           </w:p>
         </w:tc>
         <w:tc>
@@ -5843,6 +5851,14 @@
                 <w:szCs w:val="18"/>
               </w:rPr>
             </w:pPr>
+            <w:r>
+              <w:rPr>
+                <w:rFonts w:ascii="Lora" w:hAnsi="Lora"/>
+                <w:sz w:val="18"/>
+                <w:szCs w:val="18"/>
+              </w:rPr>
+              <w:t>[RED]</w:t>
+            </w:r>
           </w:p>
         </w:tc>
         <w:tc>
@@ -5858,6 +5874,14 @@
                 <w:szCs w:val="18"/>
               </w:rPr>
             </w:pPr>
+            <w:r>
+              <w:rPr>
+                <w:rFonts w:ascii="Lora" w:hAnsi="Lora"/>
+                <w:sz w:val="18"/>
+                <w:szCs w:val="18"/>
+              </w:rPr>
+              <w:t>Add failing test for basic motorcycle 2h fee</w:t>
+            </w:r>
           </w:p>
         </w:tc>
       </w:tr>
@@ -5907,6 +5931,14 @@
                 <w:szCs w:val="18"/>
               </w:rPr>
             </w:pPr>
+            <w:r>
+              <w:rPr>
+                <w:rFonts w:ascii="Lora" w:hAnsi="Lora"/>
+                <w:sz w:val="18"/>
+                <w:szCs w:val="18"/>
+              </w:rPr>
+              <w:t>58c5106</w:t>
+            </w:r>
           </w:p>
         </w:tc>
         <w:tc>
@@ -5922,6 +5954,14 @@
                 <w:szCs w:val="18"/>
               </w:rPr>
             </w:pPr>
+            <w:r>
+              <w:rPr>
+                <w:rFonts w:ascii="Lora" w:hAnsi="Lora"/>
+                <w:sz w:val="18"/>
+                <w:szCs w:val="18"/>
+              </w:rPr>
+              <w:t>[GREEN]</w:t>
+            </w:r>
           </w:p>
         </w:tc>
         <w:tc>
@@ -5937,6 +5977,14 @@
                 <w:szCs w:val="18"/>
               </w:rPr>
             </w:pPr>
+            <w:r>
+              <w:rPr>
+                <w:rFonts w:ascii="Lora" w:hAnsi="Lora"/>
+                <w:sz w:val="18"/>
+                <w:szCs w:val="18"/>
+              </w:rPr>
+              <w:t>Implement motorcycle rate calculation</w:t>
+            </w:r>
           </w:p>
         </w:tc>
       </w:tr>
@@ -5986,6 +6034,14 @@
                 <w:szCs w:val="18"/>
               </w:rPr>
             </w:pPr>
+            <w:r>
+              <w:rPr>
+                <w:rFonts w:ascii="Lora" w:hAnsi="Lora"/>
+                <w:sz w:val="18"/>
+                <w:szCs w:val="18"/>
+              </w:rPr>
+              <w:t>81fad09</w:t>
+            </w:r>
           </w:p>
         </w:tc>
         <w:tc>
@@ -6001,6 +6057,14 @@
                 <w:szCs w:val="18"/>
               </w:rPr>
             </w:pPr>
+            <w:r>
+              <w:rPr>
+                <w:rFonts w:ascii="Lora" w:hAnsi="Lora"/>
+                <w:sz w:val="18"/>
+                <w:szCs w:val="18"/>
+              </w:rPr>
+              <w:t>[RED]</w:t>
+            </w:r>
           </w:p>
         </w:tc>
         <w:tc>
@@ -6016,6 +6080,32 @@
                 <w:szCs w:val="18"/>
               </w:rPr>
             </w:pPr>
+            <w:r>
+              <w:rPr>
+                <w:rFonts w:ascii="Lora" w:hAnsi="Lora"/>
+                <w:sz w:val="18"/>
+                <w:szCs w:val="18"/>
+              </w:rPr>
+              <w:t xml:space="preserve">Add failing test for checkout before </w:t>
+            </w:r>
+            <w:proofErr w:type="spellStart"/>
+            <w:r>
+              <w:rPr>
+                <w:rFonts w:ascii="Lora" w:hAnsi="Lora"/>
+                <w:sz w:val="18"/>
+                <w:szCs w:val="18"/>
+              </w:rPr>
+              <w:t>checkIn</w:t>
+            </w:r>
+            <w:proofErr w:type="spellEnd"/>
+            <w:r>
+              <w:rPr>
+                <w:rFonts w:ascii="Lora" w:hAnsi="Lora"/>
+                <w:sz w:val="18"/>
+                <w:szCs w:val="18"/>
+              </w:rPr>
+              <w:t xml:space="preserve"> validation</w:t>
+            </w:r>
           </w:p>
         </w:tc>
       </w:tr>
@@ -6065,6 +6155,14 @@
                 <w:szCs w:val="18"/>
               </w:rPr>
             </w:pPr>
+            <w:r>
+              <w:rPr>
+                <w:rFonts w:ascii="Lora" w:hAnsi="Lora"/>
+                <w:sz w:val="18"/>
+                <w:szCs w:val="18"/>
+              </w:rPr>
+              <w:t>2e5af52</w:t>
+            </w:r>
           </w:p>
         </w:tc>
         <w:tc>
@@ -6080,6 +6178,14 @@
                 <w:szCs w:val="18"/>
               </w:rPr>
             </w:pPr>
+            <w:r>
+              <w:rPr>
+                <w:rFonts w:ascii="Lora" w:hAnsi="Lora"/>
+                <w:sz w:val="18"/>
+                <w:szCs w:val="18"/>
+              </w:rPr>
+              <w:t>[GREEN]</w:t>
+            </w:r>
           </w:p>
         </w:tc>
         <w:tc>
@@ -6095,6 +6201,42 @@
                 <w:szCs w:val="18"/>
               </w:rPr>
             </w:pPr>
+            <w:r>
+              <w:rPr>
+                <w:rFonts w:ascii="Lora" w:hAnsi="Lora"/>
+                <w:sz w:val="18"/>
+                <w:szCs w:val="18"/>
+              </w:rPr>
+              <w:t xml:space="preserve">Implement input validation for </w:t>
+            </w:r>
+            <w:proofErr w:type="spellStart"/>
+            <w:r>
+              <w:rPr>
+                <w:rFonts w:ascii="Lora" w:hAnsi="Lora"/>
+                <w:sz w:val="18"/>
+                <w:szCs w:val="18"/>
+              </w:rPr>
+              <w:t>checkOut</w:t>
+            </w:r>
+            <w:proofErr w:type="spellEnd"/>
+            <w:r>
+              <w:rPr>
+                <w:rFonts w:ascii="Lora" w:hAnsi="Lora"/>
+                <w:sz w:val="18"/>
+                <w:szCs w:val="18"/>
+              </w:rPr>
+              <w:t xml:space="preserve"> before </w:t>
+            </w:r>
+            <w:proofErr w:type="spellStart"/>
+            <w:r>
+              <w:rPr>
+                <w:rFonts w:ascii="Lora" w:hAnsi="Lora"/>
+                <w:sz w:val="18"/>
+                <w:szCs w:val="18"/>
+              </w:rPr>
+              <w:t>checkIn</w:t>
+            </w:r>
+            <w:proofErr w:type="spellEnd"/>
           </w:p>
         </w:tc>
       </w:tr>
@@ -6144,6 +6286,14 @@
                 <w:szCs w:val="18"/>
               </w:rPr>
             </w:pPr>
+            <w:r>
+              <w:rPr>
+                <w:rFonts w:ascii="Lora" w:hAnsi="Lora"/>
+                <w:sz w:val="18"/>
+                <w:szCs w:val="18"/>
+              </w:rPr>
+              <w:t>fbb40c4</w:t>
+            </w:r>
           </w:p>
         </w:tc>
         <w:tc>
@@ -6159,6 +6309,14 @@
                 <w:szCs w:val="18"/>
               </w:rPr>
             </w:pPr>
+            <w:r>
+              <w:rPr>
+                <w:rFonts w:ascii="Lora" w:hAnsi="Lora"/>
+                <w:sz w:val="18"/>
+                <w:szCs w:val="18"/>
+              </w:rPr>
+              <w:t>[RED]</w:t>
+            </w:r>
           </w:p>
         </w:tc>
         <w:tc>
@@ -6174,6 +6332,14 @@
                 <w:szCs w:val="18"/>
               </w:rPr>
             </w:pPr>
+            <w:r>
+              <w:rPr>
+                <w:rFonts w:ascii="Lora" w:hAnsi="Lora"/>
+                <w:sz w:val="18"/>
+                <w:szCs w:val="18"/>
+              </w:rPr>
+              <w:t>Add failing test for motorcycle daily cap</w:t>
+            </w:r>
           </w:p>
         </w:tc>
       </w:tr>
@@ -6223,6 +6389,14 @@
                 <w:szCs w:val="18"/>
               </w:rPr>
             </w:pPr>
+            <w:r>
+              <w:rPr>
+                <w:rFonts w:ascii="Lora" w:hAnsi="Lora"/>
+                <w:sz w:val="18"/>
+                <w:szCs w:val="18"/>
+              </w:rPr>
+              <w:t>af55d4d</w:t>
+            </w:r>
           </w:p>
         </w:tc>
         <w:tc>
@@ -6238,6 +6412,14 @@
                 <w:szCs w:val="18"/>
               </w:rPr>
             </w:pPr>
+            <w:r>
+              <w:rPr>
+                <w:rFonts w:ascii="Lora" w:hAnsi="Lora"/>
+                <w:sz w:val="18"/>
+                <w:szCs w:val="18"/>
+              </w:rPr>
+              <w:t>[GREEN]</w:t>
+            </w:r>
           </w:p>
         </w:tc>
         <w:tc>
@@ -6253,6 +6435,220 @@
                 <w:szCs w:val="18"/>
               </w:rPr>
             </w:pPr>
+            <w:r>
+              <w:rPr>
+                <w:rFonts w:ascii="Lora" w:hAnsi="Lora"/>
+                <w:sz w:val="18"/>
+                <w:szCs w:val="18"/>
+              </w:rPr>
+              <w:t>Implement daily cap for all vehicle types</w:t>
+            </w:r>
+          </w:p>
+        </w:tc>
+      </w:tr>
+      <w:tr>
+        <w:trPr>
+          <w:trHeight w:val="394"/>
+        </w:trPr>
+        <w:tc>
+          <w:tcPr>
+            <w:tcW w:w="425" w:type="dxa"/>
+            <w:shd w:val="clear" w:color="auto" w:fill="E7E6E6" w:themeFill="background2"/>
+            <w:vAlign w:val="center"/>
+          </w:tcPr>
+          <w:p>
+            <w:pPr>
+              <w:jc w:val="center"/>
+              <w:rPr>
+                <w:rFonts w:ascii="Lora" w:hAnsi="Lora"/>
+                <w:b/>
+                <w:bCs/>
+                <w:sz w:val="20"/>
+                <w:szCs w:val="20"/>
+              </w:rPr>
+            </w:pPr>
+            <w:r>
+              <w:rPr>
+                <w:rFonts w:ascii="Lora" w:hAnsi="Lora"/>
+                <w:b/>
+                <w:bCs/>
+                <w:sz w:val="20"/>
+                <w:szCs w:val="20"/>
+              </w:rPr>
+              <w:t>7</w:t>
+            </w:r>
+          </w:p>
+        </w:tc>
+        <w:tc>
+          <w:tcPr>
+            <w:tcW w:w="2526" w:type="dxa"/>
+            <w:vAlign w:val="center"/>
+          </w:tcPr>
+          <w:p>
+            <w:pPr>
+              <w:rPr>
+                <w:rFonts w:ascii="Lora" w:hAnsi="Lora"/>
+                <w:sz w:val="18"/>
+                <w:szCs w:val="18"/>
+              </w:rPr>
+            </w:pPr>
+            <w:r>
+              <w:rPr>
+                <w:rFonts w:ascii="Lora" w:hAnsi="Lora"/>
+                <w:sz w:val="18"/>
+                <w:szCs w:val="18"/>
+              </w:rPr>
+              <w:t>fcd92c3</w:t>
+            </w:r>
+          </w:p>
+        </w:tc>
+        <w:tc>
+          <w:tcPr>
+            <w:tcW w:w="3370" w:type="dxa"/>
+            <w:vAlign w:val="center"/>
+          </w:tcPr>
+          <w:p>
+            <w:pPr>
+              <w:rPr>
+                <w:rFonts w:ascii="Lora" w:hAnsi="Lora"/>
+                <w:sz w:val="18"/>
+                <w:szCs w:val="18"/>
+              </w:rPr>
+            </w:pPr>
+            <w:r>
+              <w:rPr>
+                <w:rFonts w:ascii="Lora" w:hAnsi="Lora"/>
+                <w:sz w:val="18"/>
+                <w:szCs w:val="18"/>
+              </w:rPr>
+              <w:t>[RED]</w:t>
+            </w:r>
+          </w:p>
+        </w:tc>
+        <w:tc>
+          <w:tcPr>
+            <w:tcW w:w="2947" w:type="dxa"/>
+            <w:vAlign w:val="center"/>
+          </w:tcPr>
+          <w:p>
+            <w:pPr>
+              <w:rPr>
+                <w:rFonts w:ascii="Lora" w:hAnsi="Lora"/>
+                <w:sz w:val="18"/>
+                <w:szCs w:val="18"/>
+              </w:rPr>
+            </w:pPr>
+            <w:r>
+              <w:rPr>
+                <w:rFonts w:ascii="Lora" w:hAnsi="Lora"/>
+                <w:sz w:val="18"/>
+                <w:szCs w:val="18"/>
+              </w:rPr>
+              <w:t>Add failing test for membership discounts</w:t>
+            </w:r>
+          </w:p>
+        </w:tc>
+      </w:tr>
+      <w:tr>
+        <w:trPr>
+          <w:trHeight w:val="394"/>
+        </w:trPr>
+        <w:tc>
+          <w:tcPr>
+            <w:tcW w:w="425" w:type="dxa"/>
+            <w:shd w:val="clear" w:color="auto" w:fill="E7E6E6" w:themeFill="background2"/>
+            <w:vAlign w:val="center"/>
+          </w:tcPr>
+          <w:p>
+            <w:pPr>
+              <w:jc w:val="center"/>
+              <w:rPr>
+                <w:rFonts w:ascii="Lora" w:hAnsi="Lora"/>
+                <w:b/>
+                <w:bCs/>
+                <w:sz w:val="20"/>
+                <w:szCs w:val="20"/>
+              </w:rPr>
+            </w:pPr>
+            <w:r>
+              <w:rPr>
+                <w:rFonts w:ascii="Lora" w:hAnsi="Lora"/>
+                <w:b/>
+                <w:bCs/>
+                <w:sz w:val="20"/>
+                <w:szCs w:val="20"/>
+              </w:rPr>
+              <w:t>8</w:t>
+            </w:r>
+          </w:p>
+        </w:tc>
+        <w:tc>
+          <w:tcPr>
+            <w:tcW w:w="2526" w:type="dxa"/>
+            <w:vAlign w:val="center"/>
+          </w:tcPr>
+          <w:p>
+            <w:pPr>
+              <w:rPr>
+                <w:rFonts w:ascii="Lora" w:hAnsi="Lora"/>
+                <w:sz w:val="18"/>
+                <w:szCs w:val="18"/>
+              </w:rPr>
+            </w:pPr>
+            <w:r>
+              <w:rPr>
+                <w:rFonts w:ascii="Lora" w:hAnsi="Lora"/>
+                <w:sz w:val="18"/>
+                <w:szCs w:val="18"/>
+              </w:rPr>
+              <w:t>0d71eb2</w:t>
+            </w:r>
+          </w:p>
+        </w:tc>
+        <w:tc>
+          <w:tcPr>
+            <w:tcW w:w="3370" w:type="dxa"/>
+            <w:vAlign w:val="center"/>
+          </w:tcPr>
+          <w:p>
+            <w:pPr>
+              <w:rPr>
+                <w:rFonts w:ascii="Lora" w:hAnsi="Lora"/>
+                <w:sz w:val="18"/>
+                <w:szCs w:val="18"/>
+              </w:rPr>
+            </w:pPr>
+            <w:r>
+              <w:rPr>
+                <w:rFonts w:ascii="Lora" w:hAnsi="Lora"/>
+                <w:sz w:val="18"/>
+                <w:szCs w:val="18"/>
+              </w:rPr>
+              <w:t>[GREEN]</w:t>
+            </w:r>
+          </w:p>
+        </w:tc>
+        <w:tc>
+          <w:tcPr>
+            <w:tcW w:w="2947" w:type="dxa"/>
+            <w:vAlign w:val="center"/>
+          </w:tcPr>
+          <w:p>
+            <w:pPr>
+              <w:rPr>
+                <w:rFonts w:ascii="Lora" w:hAnsi="Lora"/>
+                <w:sz w:val="18"/>
+                <w:szCs w:val="18"/>
+              </w:rPr>
+            </w:pPr>
+            <w:r>
+              <w:rPr>
+                <w:rFonts w:ascii="Lora" w:hAnsi="Lora"/>
+                <w:sz w:val="18"/>
+                <w:szCs w:val="18"/>
+              </w:rPr>
+              <w:t>Membership discounts are now working.</w:t>
+            </w:r>
           </w:p>
         </w:tc>
       </w:tr>
@@ -6445,7 +6841,6 @@
           <w:rFonts w:ascii="Lora" w:hAnsi="Lora"/>
           <w:szCs w:val="22"/>
         </w:rPr>
-        <w:lastRenderedPageBreak/>
         <w:t xml:space="preserve">Run: </w:t>
       </w:r>
       <w:r>
@@ -7094,7 +7489,7 @@
           <w:rFonts w:ascii="Consolas" w:hAnsi="Consolas"/>
           <w:b/>
           <w:bCs/>
-          <w:color w:val="70AD47" w:themeColor="accent6"/>
+          <w:color w:val="0070C0"/>
           <w:szCs w:val="22"/>
         </w:rPr>
         <w:t>dotnet test</w:t>
@@ -7369,6 +7764,7 @@
           <w:szCs w:val="32"/>
           <w:u w:val="single"/>
         </w:rPr>
+        <w:lastRenderedPageBreak/>
         <w:t xml:space="preserve">Part 4: Traceability Matrix </w:t>
       </w:r>
     </w:p>

</xml_diff>

<commit_message>
Update report with Part 3 Test results, filling total test etc
</commit_message>
<xml_diff>
--- a/TangPiseth_Report.docx
+++ b/TangPiseth_Report.docx
@@ -6794,6 +6794,445 @@
                 <w:szCs w:val="20"/>
               </w:rPr>
             </w:pPr>
+            <w:r>
+              <w:rPr>
+                <w:rFonts w:ascii="Lora" w:hAnsi="Lora"/>
+                <w:sz w:val="20"/>
+                <w:szCs w:val="20"/>
+              </w:rPr>
+              <w:lastRenderedPageBreak/>
+              <w:t>PS D:\automate-test-ITE-E5-TangPiseth\automate-test-E5-TangPiseth&gt; dotnet test --filter "</w:t>
+            </w:r>
+            <w:proofErr w:type="spellStart"/>
+            <w:r>
+              <w:rPr>
+                <w:rFonts w:ascii="Lora" w:hAnsi="Lora"/>
+                <w:sz w:val="20"/>
+                <w:szCs w:val="20"/>
+              </w:rPr>
+              <w:t>ParkingFeeCalculatorTests</w:t>
+            </w:r>
+            <w:proofErr w:type="spellEnd"/>
+            <w:r>
+              <w:rPr>
+                <w:rFonts w:ascii="Lora" w:hAnsi="Lora"/>
+                <w:sz w:val="20"/>
+                <w:szCs w:val="20"/>
+              </w:rPr>
+              <w:t>"</w:t>
+            </w:r>
+          </w:p>
+          <w:p>
+            <w:pPr>
+              <w:rPr>
+                <w:rFonts w:ascii="Lora" w:hAnsi="Lora"/>
+                <w:sz w:val="20"/>
+                <w:szCs w:val="20"/>
+              </w:rPr>
+            </w:pPr>
+            <w:r>
+              <w:rPr>
+                <w:rFonts w:ascii="Lora" w:hAnsi="Lora"/>
+                <w:sz w:val="20"/>
+                <w:szCs w:val="20"/>
+              </w:rPr>
+              <w:t>Restore complete (0.9s)</w:t>
+            </w:r>
+          </w:p>
+          <w:p>
+            <w:pPr>
+              <w:rPr>
+                <w:rFonts w:ascii="Lora" w:hAnsi="Lora"/>
+                <w:sz w:val="20"/>
+                <w:szCs w:val="20"/>
+              </w:rPr>
+            </w:pPr>
+            <w:r>
+              <w:rPr>
+                <w:rFonts w:ascii="Lora" w:hAnsi="Lora"/>
+                <w:sz w:val="20"/>
+                <w:szCs w:val="20"/>
+              </w:rPr>
+              <w:t xml:space="preserve">  </w:t>
+            </w:r>
+            <w:proofErr w:type="spellStart"/>
+            <w:r>
+              <w:rPr>
+                <w:rFonts w:ascii="Lora" w:hAnsi="Lora"/>
+                <w:sz w:val="20"/>
+                <w:szCs w:val="20"/>
+              </w:rPr>
+              <w:t>SmartPark.Core</w:t>
+            </w:r>
+            <w:proofErr w:type="spellEnd"/>
+            <w:r>
+              <w:rPr>
+                <w:rFonts w:ascii="Lora" w:hAnsi="Lora"/>
+                <w:sz w:val="20"/>
+                <w:szCs w:val="20"/>
+              </w:rPr>
+              <w:t xml:space="preserve"> net10.0 succeeded (0.2s) </w:t>
+            </w:r>
+            <w:r>
+              <w:rPr>
+                <w:rFonts w:ascii="Times New Roman" w:hAnsi="Times New Roman" w:cs="Times New Roman"/>
+                <w:sz w:val="20"/>
+                <w:szCs w:val="20"/>
+              </w:rPr>
+              <w:t>→</w:t>
+            </w:r>
+            <w:r>
+              <w:rPr>
+                <w:rFonts w:ascii="Lora" w:hAnsi="Lora"/>
+                <w:sz w:val="20"/>
+                <w:szCs w:val="20"/>
+              </w:rPr>
+              <w:t xml:space="preserve"> </w:t>
+            </w:r>
+            <w:proofErr w:type="spellStart"/>
+            <w:r>
+              <w:rPr>
+                <w:rFonts w:ascii="Lora" w:hAnsi="Lora"/>
+                <w:sz w:val="20"/>
+                <w:szCs w:val="20"/>
+              </w:rPr>
+              <w:t>src</w:t>
+            </w:r>
+            <w:proofErr w:type="spellEnd"/>
+            <w:r>
+              <w:rPr>
+                <w:rFonts w:ascii="Lora" w:hAnsi="Lora"/>
+                <w:sz w:val="20"/>
+                <w:szCs w:val="20"/>
+              </w:rPr>
+              <w:t>\</w:t>
+            </w:r>
+            <w:proofErr w:type="spellStart"/>
+            <w:r>
+              <w:rPr>
+                <w:rFonts w:ascii="Lora" w:hAnsi="Lora"/>
+                <w:sz w:val="20"/>
+                <w:szCs w:val="20"/>
+              </w:rPr>
+              <w:t>SmartPark.Core</w:t>
+            </w:r>
+            <w:proofErr w:type="spellEnd"/>
+            <w:r>
+              <w:rPr>
+                <w:rFonts w:ascii="Lora" w:hAnsi="Lora"/>
+                <w:sz w:val="20"/>
+                <w:szCs w:val="20"/>
+              </w:rPr>
+              <w:t>\bin\Debug\net10.0\SmartPark.Core.dll</w:t>
+            </w:r>
+          </w:p>
+          <w:p>
+            <w:pPr>
+              <w:rPr>
+                <w:rFonts w:ascii="Lora" w:hAnsi="Lora"/>
+                <w:sz w:val="20"/>
+                <w:szCs w:val="20"/>
+              </w:rPr>
+            </w:pPr>
+            <w:r>
+              <w:rPr>
+                <w:rFonts w:ascii="Lora" w:hAnsi="Lora"/>
+                <w:sz w:val="20"/>
+                <w:szCs w:val="20"/>
+              </w:rPr>
+              <w:t xml:space="preserve">  </w:t>
+            </w:r>
+            <w:proofErr w:type="spellStart"/>
+            <w:r>
+              <w:rPr>
+                <w:rFonts w:ascii="Lora" w:hAnsi="Lora"/>
+                <w:sz w:val="20"/>
+                <w:szCs w:val="20"/>
+              </w:rPr>
+              <w:t>SmartPark.Tests</w:t>
+            </w:r>
+            <w:proofErr w:type="spellEnd"/>
+            <w:r>
+              <w:rPr>
+                <w:rFonts w:ascii="Lora" w:hAnsi="Lora"/>
+                <w:sz w:val="20"/>
+                <w:szCs w:val="20"/>
+              </w:rPr>
+              <w:t xml:space="preserve"> net10.0 succeeded (0.3s) </w:t>
+            </w:r>
+            <w:r>
+              <w:rPr>
+                <w:rFonts w:ascii="Times New Roman" w:hAnsi="Times New Roman" w:cs="Times New Roman"/>
+                <w:sz w:val="20"/>
+                <w:szCs w:val="20"/>
+              </w:rPr>
+              <w:t>→</w:t>
+            </w:r>
+            <w:r>
+              <w:rPr>
+                <w:rFonts w:ascii="Lora" w:hAnsi="Lora"/>
+                <w:sz w:val="20"/>
+                <w:szCs w:val="20"/>
+              </w:rPr>
+              <w:t xml:space="preserve"> tests\</w:t>
+            </w:r>
+            <w:proofErr w:type="spellStart"/>
+            <w:r>
+              <w:rPr>
+                <w:rFonts w:ascii="Lora" w:hAnsi="Lora"/>
+                <w:sz w:val="20"/>
+                <w:szCs w:val="20"/>
+              </w:rPr>
+              <w:t>SmartPark.Tests</w:t>
+            </w:r>
+            <w:proofErr w:type="spellEnd"/>
+            <w:r>
+              <w:rPr>
+                <w:rFonts w:ascii="Lora" w:hAnsi="Lora"/>
+                <w:sz w:val="20"/>
+                <w:szCs w:val="20"/>
+              </w:rPr>
+              <w:t>\bin\Debug\net10.0\SmartPark.Tests.dll</w:t>
+            </w:r>
+          </w:p>
+          <w:p>
+            <w:pPr>
+              <w:rPr>
+                <w:rFonts w:ascii="Lora" w:hAnsi="Lora"/>
+                <w:sz w:val="20"/>
+                <w:szCs w:val="20"/>
+              </w:rPr>
+            </w:pPr>
+            <w:r>
+              <w:rPr>
+                <w:rFonts w:ascii="Lora" w:hAnsi="Lora"/>
+                <w:sz w:val="20"/>
+                <w:szCs w:val="20"/>
+              </w:rPr>
+              <w:t xml:space="preserve">[xUnit.net 00:00:00.00] xUnit.net </w:t>
+            </w:r>
+            <w:proofErr w:type="spellStart"/>
+            <w:r>
+              <w:rPr>
+                <w:rFonts w:ascii="Lora" w:hAnsi="Lora"/>
+                <w:sz w:val="20"/>
+                <w:szCs w:val="20"/>
+              </w:rPr>
+              <w:t>VSTest</w:t>
+            </w:r>
+            <w:proofErr w:type="spellEnd"/>
+            <w:r>
+              <w:rPr>
+                <w:rFonts w:ascii="Lora" w:hAnsi="Lora"/>
+                <w:sz w:val="20"/>
+                <w:szCs w:val="20"/>
+              </w:rPr>
+              <w:t xml:space="preserve"> Adapter v3.1.4+50e68bbb8b (64-bit .NET 10.0.0)</w:t>
+            </w:r>
+          </w:p>
+          <w:p>
+            <w:pPr>
+              <w:rPr>
+                <w:rFonts w:ascii="Lora" w:hAnsi="Lora"/>
+                <w:sz w:val="20"/>
+                <w:szCs w:val="20"/>
+              </w:rPr>
+            </w:pPr>
+            <w:r>
+              <w:rPr>
+                <w:rFonts w:ascii="Lora" w:hAnsi="Lora"/>
+                <w:sz w:val="20"/>
+                <w:szCs w:val="20"/>
+              </w:rPr>
+              <w:t xml:space="preserve">[xUnit.net 00:00:00.10]   Discovering: </w:t>
+            </w:r>
+            <w:proofErr w:type="spellStart"/>
+            <w:r>
+              <w:rPr>
+                <w:rFonts w:ascii="Lora" w:hAnsi="Lora"/>
+                <w:sz w:val="20"/>
+                <w:szCs w:val="20"/>
+              </w:rPr>
+              <w:t>SmartPark.Tests</w:t>
+            </w:r>
+            <w:proofErr w:type="spellEnd"/>
+          </w:p>
+          <w:p>
+            <w:pPr>
+              <w:rPr>
+                <w:rFonts w:ascii="Lora" w:hAnsi="Lora"/>
+                <w:sz w:val="20"/>
+                <w:szCs w:val="20"/>
+              </w:rPr>
+            </w:pPr>
+            <w:r>
+              <w:rPr>
+                <w:rFonts w:ascii="Lora" w:hAnsi="Lora"/>
+                <w:sz w:val="20"/>
+                <w:szCs w:val="20"/>
+              </w:rPr>
+              <w:t>[xUnit.net 00:00:00.17]   Discovered</w:t>
+            </w:r>
+            <w:proofErr w:type="gramStart"/>
+            <w:r>
+              <w:rPr>
+                <w:rFonts w:ascii="Lora" w:hAnsi="Lora"/>
+                <w:sz w:val="20"/>
+                <w:szCs w:val="20"/>
+              </w:rPr>
+              <w:t xml:space="preserve">:  </w:t>
+            </w:r>
+            <w:proofErr w:type="spellStart"/>
+            <w:r>
+              <w:rPr>
+                <w:rFonts w:ascii="Lora" w:hAnsi="Lora"/>
+                <w:sz w:val="20"/>
+                <w:szCs w:val="20"/>
+              </w:rPr>
+              <w:t>SmartPark</w:t>
+            </w:r>
+            <w:proofErr w:type="gramEnd"/>
+            <w:r>
+              <w:rPr>
+                <w:rFonts w:ascii="Lora" w:hAnsi="Lora"/>
+                <w:sz w:val="20"/>
+                <w:szCs w:val="20"/>
+              </w:rPr>
+              <w:t>.Tests</w:t>
+            </w:r>
+            <w:proofErr w:type="spellEnd"/>
+          </w:p>
+          <w:p>
+            <w:pPr>
+              <w:rPr>
+                <w:rFonts w:ascii="Lora" w:hAnsi="Lora"/>
+                <w:sz w:val="20"/>
+                <w:szCs w:val="20"/>
+              </w:rPr>
+            </w:pPr>
+            <w:r>
+              <w:rPr>
+                <w:rFonts w:ascii="Lora" w:hAnsi="Lora"/>
+                <w:sz w:val="20"/>
+                <w:szCs w:val="20"/>
+              </w:rPr>
+              <w:t xml:space="preserve">[xUnit.net 00:00:00.21]   Starting:    </w:t>
+            </w:r>
+            <w:proofErr w:type="spellStart"/>
+            <w:r>
+              <w:rPr>
+                <w:rFonts w:ascii="Lora" w:hAnsi="Lora"/>
+                <w:sz w:val="20"/>
+                <w:szCs w:val="20"/>
+              </w:rPr>
+              <w:t>SmartPark.Tests</w:t>
+            </w:r>
+            <w:proofErr w:type="spellEnd"/>
+          </w:p>
+          <w:p>
+            <w:pPr>
+              <w:rPr>
+                <w:rFonts w:ascii="Lora" w:hAnsi="Lora"/>
+                <w:sz w:val="20"/>
+                <w:szCs w:val="20"/>
+              </w:rPr>
+            </w:pPr>
+            <w:r>
+              <w:rPr>
+                <w:rFonts w:ascii="Lora" w:hAnsi="Lora"/>
+                <w:sz w:val="20"/>
+                <w:szCs w:val="20"/>
+              </w:rPr>
+              <w:t xml:space="preserve">[xUnit.net 00:00:00.32]   Finished:    </w:t>
+            </w:r>
+            <w:proofErr w:type="spellStart"/>
+            <w:r>
+              <w:rPr>
+                <w:rFonts w:ascii="Lora" w:hAnsi="Lora"/>
+                <w:sz w:val="20"/>
+                <w:szCs w:val="20"/>
+              </w:rPr>
+              <w:t>SmartPark.Tests</w:t>
+            </w:r>
+            <w:proofErr w:type="spellEnd"/>
+          </w:p>
+          <w:p>
+            <w:pPr>
+              <w:rPr>
+                <w:rFonts w:ascii="Lora" w:hAnsi="Lora"/>
+                <w:sz w:val="20"/>
+                <w:szCs w:val="20"/>
+              </w:rPr>
+            </w:pPr>
+            <w:r>
+              <w:rPr>
+                <w:rFonts w:ascii="Lora" w:hAnsi="Lora"/>
+                <w:sz w:val="20"/>
+                <w:szCs w:val="20"/>
+              </w:rPr>
+              <w:t xml:space="preserve">  </w:t>
+            </w:r>
+            <w:proofErr w:type="spellStart"/>
+            <w:r>
+              <w:rPr>
+                <w:rFonts w:ascii="Lora" w:hAnsi="Lora"/>
+                <w:sz w:val="20"/>
+                <w:szCs w:val="20"/>
+              </w:rPr>
+              <w:t>SmartPark.Tests</w:t>
+            </w:r>
+            <w:proofErr w:type="spellEnd"/>
+            <w:r>
+              <w:rPr>
+                <w:rFonts w:ascii="Lora" w:hAnsi="Lora"/>
+                <w:sz w:val="20"/>
+                <w:szCs w:val="20"/>
+              </w:rPr>
+              <w:t xml:space="preserve"> test net10.0 succeeded (1.3s)</w:t>
+            </w:r>
+          </w:p>
+          <w:p>
+            <w:pPr>
+              <w:rPr>
+                <w:rFonts w:ascii="Lora" w:hAnsi="Lora"/>
+                <w:sz w:val="20"/>
+                <w:szCs w:val="20"/>
+              </w:rPr>
+            </w:pPr>
+          </w:p>
+          <w:p>
+            <w:pPr>
+              <w:rPr>
+                <w:rFonts w:ascii="Lora" w:hAnsi="Lora"/>
+                <w:sz w:val="20"/>
+                <w:szCs w:val="20"/>
+              </w:rPr>
+            </w:pPr>
+            <w:r>
+              <w:rPr>
+                <w:rFonts w:ascii="Lora" w:hAnsi="Lora"/>
+                <w:sz w:val="20"/>
+                <w:szCs w:val="20"/>
+              </w:rPr>
+              <w:t>Test summary: total: 12, failed: 0, succeeded: 12, skipped: 0, duration: 1.3s</w:t>
+            </w:r>
+          </w:p>
+          <w:p>
+            <w:pPr>
+              <w:rPr>
+                <w:rFonts w:ascii="Lora" w:hAnsi="Lora"/>
+                <w:sz w:val="20"/>
+                <w:szCs w:val="20"/>
+              </w:rPr>
+            </w:pPr>
+            <w:r>
+              <w:rPr>
+                <w:rFonts w:ascii="Lora" w:hAnsi="Lora"/>
+                <w:sz w:val="20"/>
+                <w:szCs w:val="20"/>
+              </w:rPr>
+              <w:t>Build succeeded in 3.0s</w:t>
+            </w:r>
           </w:p>
         </w:tc>
       </w:tr>
@@ -6898,6 +7337,444 @@
                 <w:szCs w:val="20"/>
               </w:rPr>
             </w:pPr>
+            <w:r>
+              <w:rPr>
+                <w:rFonts w:ascii="Lora" w:hAnsi="Lora"/>
+                <w:sz w:val="20"/>
+                <w:szCs w:val="20"/>
+              </w:rPr>
+              <w:t>PS D:\automate-test-ITE-E5-TangPiseth\automate-test-E5-TangPiseth&gt; dotnet test --filter "</w:t>
+            </w:r>
+            <w:proofErr w:type="spellStart"/>
+            <w:r>
+              <w:rPr>
+                <w:rFonts w:ascii="Lora" w:hAnsi="Lora"/>
+                <w:sz w:val="20"/>
+                <w:szCs w:val="20"/>
+              </w:rPr>
+              <w:t>ParkingSessionManagerTests</w:t>
+            </w:r>
+            <w:proofErr w:type="spellEnd"/>
+            <w:r>
+              <w:rPr>
+                <w:rFonts w:ascii="Lora" w:hAnsi="Lora"/>
+                <w:sz w:val="20"/>
+                <w:szCs w:val="20"/>
+              </w:rPr>
+              <w:t>"</w:t>
+            </w:r>
+          </w:p>
+          <w:p>
+            <w:pPr>
+              <w:rPr>
+                <w:rFonts w:ascii="Lora" w:hAnsi="Lora"/>
+                <w:sz w:val="20"/>
+                <w:szCs w:val="20"/>
+              </w:rPr>
+            </w:pPr>
+            <w:r>
+              <w:rPr>
+                <w:rFonts w:ascii="Lora" w:hAnsi="Lora"/>
+                <w:sz w:val="20"/>
+                <w:szCs w:val="20"/>
+              </w:rPr>
+              <w:t>Restore complete (0.9s)</w:t>
+            </w:r>
+          </w:p>
+          <w:p>
+            <w:pPr>
+              <w:rPr>
+                <w:rFonts w:ascii="Lora" w:hAnsi="Lora"/>
+                <w:sz w:val="20"/>
+                <w:szCs w:val="20"/>
+              </w:rPr>
+            </w:pPr>
+            <w:r>
+              <w:rPr>
+                <w:rFonts w:ascii="Lora" w:hAnsi="Lora"/>
+                <w:sz w:val="20"/>
+                <w:szCs w:val="20"/>
+              </w:rPr>
+              <w:t xml:space="preserve">  </w:t>
+            </w:r>
+            <w:proofErr w:type="spellStart"/>
+            <w:r>
+              <w:rPr>
+                <w:rFonts w:ascii="Lora" w:hAnsi="Lora"/>
+                <w:sz w:val="20"/>
+                <w:szCs w:val="20"/>
+              </w:rPr>
+              <w:t>SmartPark.Core</w:t>
+            </w:r>
+            <w:proofErr w:type="spellEnd"/>
+            <w:r>
+              <w:rPr>
+                <w:rFonts w:ascii="Lora" w:hAnsi="Lora"/>
+                <w:sz w:val="20"/>
+                <w:szCs w:val="20"/>
+              </w:rPr>
+              <w:t xml:space="preserve"> net10.0 succeeded (0.2s) </w:t>
+            </w:r>
+            <w:r>
+              <w:rPr>
+                <w:rFonts w:ascii="Times New Roman" w:hAnsi="Times New Roman" w:cs="Times New Roman"/>
+                <w:sz w:val="20"/>
+                <w:szCs w:val="20"/>
+              </w:rPr>
+              <w:t>→</w:t>
+            </w:r>
+            <w:r>
+              <w:rPr>
+                <w:rFonts w:ascii="Lora" w:hAnsi="Lora"/>
+                <w:sz w:val="20"/>
+                <w:szCs w:val="20"/>
+              </w:rPr>
+              <w:t xml:space="preserve"> </w:t>
+            </w:r>
+            <w:proofErr w:type="spellStart"/>
+            <w:r>
+              <w:rPr>
+                <w:rFonts w:ascii="Lora" w:hAnsi="Lora"/>
+                <w:sz w:val="20"/>
+                <w:szCs w:val="20"/>
+              </w:rPr>
+              <w:t>src</w:t>
+            </w:r>
+            <w:proofErr w:type="spellEnd"/>
+            <w:r>
+              <w:rPr>
+                <w:rFonts w:ascii="Lora" w:hAnsi="Lora"/>
+                <w:sz w:val="20"/>
+                <w:szCs w:val="20"/>
+              </w:rPr>
+              <w:t>\</w:t>
+            </w:r>
+            <w:proofErr w:type="spellStart"/>
+            <w:r>
+              <w:rPr>
+                <w:rFonts w:ascii="Lora" w:hAnsi="Lora"/>
+                <w:sz w:val="20"/>
+                <w:szCs w:val="20"/>
+              </w:rPr>
+              <w:t>SmartPark.Core</w:t>
+            </w:r>
+            <w:proofErr w:type="spellEnd"/>
+            <w:r>
+              <w:rPr>
+                <w:rFonts w:ascii="Lora" w:hAnsi="Lora"/>
+                <w:sz w:val="20"/>
+                <w:szCs w:val="20"/>
+              </w:rPr>
+              <w:t>\bin\Debug\net10.0\SmartPark.Core.dll</w:t>
+            </w:r>
+          </w:p>
+          <w:p>
+            <w:pPr>
+              <w:rPr>
+                <w:rFonts w:ascii="Lora" w:hAnsi="Lora"/>
+                <w:sz w:val="20"/>
+                <w:szCs w:val="20"/>
+              </w:rPr>
+            </w:pPr>
+            <w:r>
+              <w:rPr>
+                <w:rFonts w:ascii="Lora" w:hAnsi="Lora"/>
+                <w:sz w:val="20"/>
+                <w:szCs w:val="20"/>
+              </w:rPr>
+              <w:t xml:space="preserve">  </w:t>
+            </w:r>
+            <w:proofErr w:type="spellStart"/>
+            <w:r>
+              <w:rPr>
+                <w:rFonts w:ascii="Lora" w:hAnsi="Lora"/>
+                <w:sz w:val="20"/>
+                <w:szCs w:val="20"/>
+              </w:rPr>
+              <w:t>SmartPark.Tests</w:t>
+            </w:r>
+            <w:proofErr w:type="spellEnd"/>
+            <w:r>
+              <w:rPr>
+                <w:rFonts w:ascii="Lora" w:hAnsi="Lora"/>
+                <w:sz w:val="20"/>
+                <w:szCs w:val="20"/>
+              </w:rPr>
+              <w:t xml:space="preserve"> net10.0 succeeded (0.3s) </w:t>
+            </w:r>
+            <w:r>
+              <w:rPr>
+                <w:rFonts w:ascii="Times New Roman" w:hAnsi="Times New Roman" w:cs="Times New Roman"/>
+                <w:sz w:val="20"/>
+                <w:szCs w:val="20"/>
+              </w:rPr>
+              <w:t>→</w:t>
+            </w:r>
+            <w:r>
+              <w:rPr>
+                <w:rFonts w:ascii="Lora" w:hAnsi="Lora"/>
+                <w:sz w:val="20"/>
+                <w:szCs w:val="20"/>
+              </w:rPr>
+              <w:t xml:space="preserve"> tests\</w:t>
+            </w:r>
+            <w:proofErr w:type="spellStart"/>
+            <w:r>
+              <w:rPr>
+                <w:rFonts w:ascii="Lora" w:hAnsi="Lora"/>
+                <w:sz w:val="20"/>
+                <w:szCs w:val="20"/>
+              </w:rPr>
+              <w:t>SmartPark.Tests</w:t>
+            </w:r>
+            <w:proofErr w:type="spellEnd"/>
+            <w:r>
+              <w:rPr>
+                <w:rFonts w:ascii="Lora" w:hAnsi="Lora"/>
+                <w:sz w:val="20"/>
+                <w:szCs w:val="20"/>
+              </w:rPr>
+              <w:t>\bin\Debug\net10.0\SmartPark.Tests.dll</w:t>
+            </w:r>
+          </w:p>
+          <w:p>
+            <w:pPr>
+              <w:rPr>
+                <w:rFonts w:ascii="Lora" w:hAnsi="Lora"/>
+                <w:sz w:val="20"/>
+                <w:szCs w:val="20"/>
+              </w:rPr>
+            </w:pPr>
+            <w:r>
+              <w:rPr>
+                <w:rFonts w:ascii="Lora" w:hAnsi="Lora"/>
+                <w:sz w:val="20"/>
+                <w:szCs w:val="20"/>
+              </w:rPr>
+              <w:t xml:space="preserve">[xUnit.net 00:00:00.00] xUnit.net </w:t>
+            </w:r>
+            <w:proofErr w:type="spellStart"/>
+            <w:r>
+              <w:rPr>
+                <w:rFonts w:ascii="Lora" w:hAnsi="Lora"/>
+                <w:sz w:val="20"/>
+                <w:szCs w:val="20"/>
+              </w:rPr>
+              <w:t>VSTest</w:t>
+            </w:r>
+            <w:proofErr w:type="spellEnd"/>
+            <w:r>
+              <w:rPr>
+                <w:rFonts w:ascii="Lora" w:hAnsi="Lora"/>
+                <w:sz w:val="20"/>
+                <w:szCs w:val="20"/>
+              </w:rPr>
+              <w:t xml:space="preserve"> Adapter v3.1.4+50e68bbb8b (64-bit .NET 10.0.0)</w:t>
+            </w:r>
+          </w:p>
+          <w:p>
+            <w:pPr>
+              <w:rPr>
+                <w:rFonts w:ascii="Lora" w:hAnsi="Lora"/>
+                <w:sz w:val="20"/>
+                <w:szCs w:val="20"/>
+              </w:rPr>
+            </w:pPr>
+            <w:r>
+              <w:rPr>
+                <w:rFonts w:ascii="Lora" w:hAnsi="Lora"/>
+                <w:sz w:val="20"/>
+                <w:szCs w:val="20"/>
+              </w:rPr>
+              <w:t xml:space="preserve">[xUnit.net 00:00:00.11]   Discovering: </w:t>
+            </w:r>
+            <w:proofErr w:type="spellStart"/>
+            <w:r>
+              <w:rPr>
+                <w:rFonts w:ascii="Lora" w:hAnsi="Lora"/>
+                <w:sz w:val="20"/>
+                <w:szCs w:val="20"/>
+              </w:rPr>
+              <w:t>SmartPark.Tests</w:t>
+            </w:r>
+            <w:proofErr w:type="spellEnd"/>
+          </w:p>
+          <w:p>
+            <w:pPr>
+              <w:rPr>
+                <w:rFonts w:ascii="Lora" w:hAnsi="Lora"/>
+                <w:sz w:val="20"/>
+                <w:szCs w:val="20"/>
+              </w:rPr>
+            </w:pPr>
+            <w:r>
+              <w:rPr>
+                <w:rFonts w:ascii="Lora" w:hAnsi="Lora"/>
+                <w:sz w:val="20"/>
+                <w:szCs w:val="20"/>
+              </w:rPr>
+              <w:t>[xUnit.net 00:00:00.17]   Discovered</w:t>
+            </w:r>
+            <w:proofErr w:type="gramStart"/>
+            <w:r>
+              <w:rPr>
+                <w:rFonts w:ascii="Lora" w:hAnsi="Lora"/>
+                <w:sz w:val="20"/>
+                <w:szCs w:val="20"/>
+              </w:rPr>
+              <w:t xml:space="preserve">:  </w:t>
+            </w:r>
+            <w:proofErr w:type="spellStart"/>
+            <w:r>
+              <w:rPr>
+                <w:rFonts w:ascii="Lora" w:hAnsi="Lora"/>
+                <w:sz w:val="20"/>
+                <w:szCs w:val="20"/>
+              </w:rPr>
+              <w:t>SmartPark</w:t>
+            </w:r>
+            <w:proofErr w:type="gramEnd"/>
+            <w:r>
+              <w:rPr>
+                <w:rFonts w:ascii="Lora" w:hAnsi="Lora"/>
+                <w:sz w:val="20"/>
+                <w:szCs w:val="20"/>
+              </w:rPr>
+              <w:t>.Tests</w:t>
+            </w:r>
+            <w:proofErr w:type="spellEnd"/>
+          </w:p>
+          <w:p>
+            <w:pPr>
+              <w:rPr>
+                <w:rFonts w:ascii="Lora" w:hAnsi="Lora"/>
+                <w:sz w:val="20"/>
+                <w:szCs w:val="20"/>
+              </w:rPr>
+            </w:pPr>
+            <w:r>
+              <w:rPr>
+                <w:rFonts w:ascii="Lora" w:hAnsi="Lora"/>
+                <w:sz w:val="20"/>
+                <w:szCs w:val="20"/>
+              </w:rPr>
+              <w:t xml:space="preserve">[xUnit.net 00:00:00.20]   Starting:    </w:t>
+            </w:r>
+            <w:proofErr w:type="spellStart"/>
+            <w:r>
+              <w:rPr>
+                <w:rFonts w:ascii="Lora" w:hAnsi="Lora"/>
+                <w:sz w:val="20"/>
+                <w:szCs w:val="20"/>
+              </w:rPr>
+              <w:t>SmartPark.Tests</w:t>
+            </w:r>
+            <w:proofErr w:type="spellEnd"/>
+          </w:p>
+          <w:p>
+            <w:pPr>
+              <w:rPr>
+                <w:rFonts w:ascii="Lora" w:hAnsi="Lora"/>
+                <w:sz w:val="20"/>
+                <w:szCs w:val="20"/>
+              </w:rPr>
+            </w:pPr>
+            <w:r>
+              <w:rPr>
+                <w:rFonts w:ascii="Lora" w:hAnsi="Lora"/>
+                <w:sz w:val="20"/>
+                <w:szCs w:val="20"/>
+              </w:rPr>
+              <w:t xml:space="preserve">[xUnit.net 00:00:00.35]   Finished:    </w:t>
+            </w:r>
+            <w:proofErr w:type="spellStart"/>
+            <w:r>
+              <w:rPr>
+                <w:rFonts w:ascii="Lora" w:hAnsi="Lora"/>
+                <w:sz w:val="20"/>
+                <w:szCs w:val="20"/>
+              </w:rPr>
+              <w:t>SmartPark.Tests</w:t>
+            </w:r>
+            <w:proofErr w:type="spellEnd"/>
+          </w:p>
+          <w:p>
+            <w:pPr>
+              <w:rPr>
+                <w:rFonts w:ascii="Lora" w:hAnsi="Lora"/>
+                <w:sz w:val="20"/>
+                <w:szCs w:val="20"/>
+              </w:rPr>
+            </w:pPr>
+            <w:r>
+              <w:rPr>
+                <w:rFonts w:ascii="Lora" w:hAnsi="Lora"/>
+                <w:sz w:val="20"/>
+                <w:szCs w:val="20"/>
+              </w:rPr>
+              <w:t xml:space="preserve">  </w:t>
+            </w:r>
+            <w:proofErr w:type="spellStart"/>
+            <w:r>
+              <w:rPr>
+                <w:rFonts w:ascii="Lora" w:hAnsi="Lora"/>
+                <w:sz w:val="20"/>
+                <w:szCs w:val="20"/>
+              </w:rPr>
+              <w:t>SmartPark.Tests</w:t>
+            </w:r>
+            <w:proofErr w:type="spellEnd"/>
+            <w:r>
+              <w:rPr>
+                <w:rFonts w:ascii="Lora" w:hAnsi="Lora"/>
+                <w:sz w:val="20"/>
+                <w:szCs w:val="20"/>
+              </w:rPr>
+              <w:t xml:space="preserve"> test net10.0 succeeded (1.4s)</w:t>
+            </w:r>
+          </w:p>
+          <w:p>
+            <w:pPr>
+              <w:rPr>
+                <w:rFonts w:ascii="Lora" w:hAnsi="Lora"/>
+                <w:sz w:val="20"/>
+                <w:szCs w:val="20"/>
+              </w:rPr>
+            </w:pPr>
+          </w:p>
+          <w:p>
+            <w:pPr>
+              <w:rPr>
+                <w:rFonts w:ascii="Lora" w:hAnsi="Lora"/>
+                <w:sz w:val="20"/>
+                <w:szCs w:val="20"/>
+              </w:rPr>
+            </w:pPr>
+            <w:r>
+              <w:rPr>
+                <w:rFonts w:ascii="Lora" w:hAnsi="Lora"/>
+                <w:sz w:val="20"/>
+                <w:szCs w:val="20"/>
+              </w:rPr>
+              <w:t>Test summary: total: 1, failed: 0, succeeded: 1, skipped: 0, duration: 1.3s</w:t>
+            </w:r>
+          </w:p>
+          <w:p>
+            <w:pPr>
+              <w:rPr>
+                <w:rFonts w:ascii="Lora" w:hAnsi="Lora"/>
+                <w:sz w:val="20"/>
+                <w:szCs w:val="20"/>
+              </w:rPr>
+            </w:pPr>
+            <w:r>
+              <w:rPr>
+                <w:rFonts w:ascii="Lora" w:hAnsi="Lora"/>
+                <w:sz w:val="20"/>
+                <w:szCs w:val="20"/>
+              </w:rPr>
+              <w:t>Build succeeded in 3.0s</w:t>
+            </w:r>
           </w:p>
         </w:tc>
       </w:tr>
@@ -6943,12 +7820,39 @@
           <w:szCs w:val="22"/>
         </w:rPr>
       </w:pPr>
+      <w:proofErr w:type="gramStart"/>
       <w:r>
         <w:rPr>
           <w:rFonts w:ascii="Lora" w:hAnsi="Lora"/>
           <w:szCs w:val="22"/>
         </w:rPr>
-        <w:t>Run your FsCheck tests. The output should show how many random inputs were tested.</w:t>
+        <w:t>Run :</w:t>
+      </w:r>
+      <w:proofErr w:type="gramEnd"/>
+      <w:r>
+        <w:rPr>
+          <w:rFonts w:ascii="Lora" w:hAnsi="Lora"/>
+          <w:szCs w:val="22"/>
+        </w:rPr>
+        <w:t xml:space="preserve"> </w:t>
+      </w:r>
+      <w:r>
+        <w:rPr>
+          <w:rFonts w:ascii="Lora" w:hAnsi="Lora"/>
+          <w:b/>
+          <w:bCs/>
+          <w:color w:val="0070C0"/>
+          <w:szCs w:val="22"/>
+        </w:rPr>
+        <w:t>dotnet test --filter "Property"</w:t>
+      </w:r>
+      <w:r>
+        <w:rPr>
+          <w:rFonts w:ascii="Lora" w:hAnsi="Lora"/>
+          <w:color w:val="0070C0"/>
+          <w:szCs w:val="22"/>
+        </w:rPr>
+        <w:t xml:space="preserve"> </w:t>
       </w:r>
     </w:p>
     <w:tbl>
@@ -6973,6 +7877,412 @@
                 <w:szCs w:val="20"/>
               </w:rPr>
             </w:pPr>
+            <w:r>
+              <w:rPr>
+                <w:rFonts w:ascii="Consolas" w:hAnsi="Consolas"/>
+                <w:sz w:val="20"/>
+                <w:szCs w:val="20"/>
+              </w:rPr>
+              <w:t xml:space="preserve">PS D:\automate-test-ITE-E5-TangPiseth\automate-test-E5-TangPiseth&gt; dotnet test --filter "Property" </w:t>
+            </w:r>
+          </w:p>
+          <w:p>
+            <w:pPr>
+              <w:rPr>
+                <w:rFonts w:ascii="Consolas" w:hAnsi="Consolas"/>
+                <w:sz w:val="20"/>
+                <w:szCs w:val="20"/>
+              </w:rPr>
+            </w:pPr>
+            <w:r>
+              <w:rPr>
+                <w:rFonts w:ascii="Consolas" w:hAnsi="Consolas"/>
+                <w:sz w:val="20"/>
+                <w:szCs w:val="20"/>
+              </w:rPr>
+              <w:t>Restore complete (0.9s)</w:t>
+            </w:r>
+          </w:p>
+          <w:p>
+            <w:pPr>
+              <w:rPr>
+                <w:rFonts w:ascii="Consolas" w:hAnsi="Consolas"/>
+                <w:sz w:val="20"/>
+                <w:szCs w:val="20"/>
+              </w:rPr>
+            </w:pPr>
+            <w:r>
+              <w:rPr>
+                <w:rFonts w:ascii="Consolas" w:hAnsi="Consolas"/>
+                <w:sz w:val="20"/>
+                <w:szCs w:val="20"/>
+              </w:rPr>
+              <w:t xml:space="preserve">  </w:t>
+            </w:r>
+            <w:proofErr w:type="spellStart"/>
+            <w:r>
+              <w:rPr>
+                <w:rFonts w:ascii="Consolas" w:hAnsi="Consolas"/>
+                <w:sz w:val="20"/>
+                <w:szCs w:val="20"/>
+              </w:rPr>
+              <w:t>SmartPark.Core</w:t>
+            </w:r>
+            <w:proofErr w:type="spellEnd"/>
+            <w:r>
+              <w:rPr>
+                <w:rFonts w:ascii="Consolas" w:hAnsi="Consolas"/>
+                <w:sz w:val="20"/>
+                <w:szCs w:val="20"/>
+              </w:rPr>
+              <w:t xml:space="preserve"> net10.0 succeeded (0.1s) → </w:t>
+            </w:r>
+            <w:proofErr w:type="spellStart"/>
+            <w:r>
+              <w:rPr>
+                <w:rFonts w:ascii="Consolas" w:hAnsi="Consolas"/>
+                <w:sz w:val="20"/>
+                <w:szCs w:val="20"/>
+              </w:rPr>
+              <w:t>src</w:t>
+            </w:r>
+            <w:proofErr w:type="spellEnd"/>
+            <w:r>
+              <w:rPr>
+                <w:rFonts w:ascii="Consolas" w:hAnsi="Consolas"/>
+                <w:sz w:val="20"/>
+                <w:szCs w:val="20"/>
+              </w:rPr>
+              <w:t>\</w:t>
+            </w:r>
+            <w:proofErr w:type="spellStart"/>
+            <w:r>
+              <w:rPr>
+                <w:rFonts w:ascii="Consolas" w:hAnsi="Consolas"/>
+                <w:sz w:val="20"/>
+                <w:szCs w:val="20"/>
+              </w:rPr>
+              <w:t>SmartPark.Core</w:t>
+            </w:r>
+            <w:proofErr w:type="spellEnd"/>
+            <w:r>
+              <w:rPr>
+                <w:rFonts w:ascii="Consolas" w:hAnsi="Consolas"/>
+                <w:sz w:val="20"/>
+                <w:szCs w:val="20"/>
+              </w:rPr>
+              <w:t>\bin\Debug\net10.0\SmartPark.Core.dll</w:t>
+            </w:r>
+          </w:p>
+          <w:p>
+            <w:pPr>
+              <w:rPr>
+                <w:rFonts w:ascii="Consolas" w:hAnsi="Consolas"/>
+                <w:sz w:val="20"/>
+                <w:szCs w:val="20"/>
+              </w:rPr>
+            </w:pPr>
+            <w:r>
+              <w:rPr>
+                <w:rFonts w:ascii="Consolas" w:hAnsi="Consolas"/>
+                <w:sz w:val="20"/>
+                <w:szCs w:val="20"/>
+              </w:rPr>
+              <w:t xml:space="preserve">  </w:t>
+            </w:r>
+            <w:proofErr w:type="spellStart"/>
+            <w:r>
+              <w:rPr>
+                <w:rFonts w:ascii="Consolas" w:hAnsi="Consolas"/>
+                <w:sz w:val="20"/>
+                <w:szCs w:val="20"/>
+              </w:rPr>
+              <w:t>SmartPark.Tests</w:t>
+            </w:r>
+            <w:proofErr w:type="spellEnd"/>
+            <w:r>
+              <w:rPr>
+                <w:rFonts w:ascii="Consolas" w:hAnsi="Consolas"/>
+                <w:sz w:val="20"/>
+                <w:szCs w:val="20"/>
+              </w:rPr>
+              <w:t xml:space="preserve"> net10.0 succeeded (0.2s) → tests\</w:t>
+            </w:r>
+            <w:proofErr w:type="spellStart"/>
+            <w:r>
+              <w:rPr>
+                <w:rFonts w:ascii="Consolas" w:hAnsi="Consolas"/>
+                <w:sz w:val="20"/>
+                <w:szCs w:val="20"/>
+              </w:rPr>
+              <w:t>SmartPark.Tests</w:t>
+            </w:r>
+            <w:proofErr w:type="spellEnd"/>
+            <w:r>
+              <w:rPr>
+                <w:rFonts w:ascii="Consolas" w:hAnsi="Consolas"/>
+                <w:sz w:val="20"/>
+                <w:szCs w:val="20"/>
+              </w:rPr>
+              <w:t>\bin\Debug\net10.0\SmartPark.Tests.dll</w:t>
+            </w:r>
+          </w:p>
+          <w:p>
+            <w:pPr>
+              <w:rPr>
+                <w:rFonts w:ascii="Consolas" w:hAnsi="Consolas"/>
+                <w:sz w:val="20"/>
+                <w:szCs w:val="20"/>
+              </w:rPr>
+            </w:pPr>
+            <w:r>
+              <w:rPr>
+                <w:rFonts w:ascii="Consolas" w:hAnsi="Consolas"/>
+                <w:sz w:val="20"/>
+                <w:szCs w:val="20"/>
+              </w:rPr>
+              <w:lastRenderedPageBreak/>
+              <w:t xml:space="preserve">[xUnit.net 00:00:00.00] xUnit.net </w:t>
+            </w:r>
+            <w:proofErr w:type="spellStart"/>
+            <w:r>
+              <w:rPr>
+                <w:rFonts w:ascii="Consolas" w:hAnsi="Consolas"/>
+                <w:sz w:val="20"/>
+                <w:szCs w:val="20"/>
+              </w:rPr>
+              <w:t>VSTest</w:t>
+            </w:r>
+            <w:proofErr w:type="spellEnd"/>
+            <w:r>
+              <w:rPr>
+                <w:rFonts w:ascii="Consolas" w:hAnsi="Consolas"/>
+                <w:sz w:val="20"/>
+                <w:szCs w:val="20"/>
+              </w:rPr>
+              <w:t xml:space="preserve"> Adapter v3.1.4+50e68bbb8b (64-bit .NET 10.0.0)</w:t>
+            </w:r>
+          </w:p>
+          <w:p>
+            <w:pPr>
+              <w:rPr>
+                <w:rFonts w:ascii="Consolas" w:hAnsi="Consolas"/>
+                <w:sz w:val="20"/>
+                <w:szCs w:val="20"/>
+              </w:rPr>
+            </w:pPr>
+            <w:r>
+              <w:rPr>
+                <w:rFonts w:ascii="Consolas" w:hAnsi="Consolas"/>
+                <w:sz w:val="20"/>
+                <w:szCs w:val="20"/>
+              </w:rPr>
+              <w:t xml:space="preserve">[xUnit.net 00:00:00.12]   Discovering: </w:t>
+            </w:r>
+            <w:proofErr w:type="spellStart"/>
+            <w:r>
+              <w:rPr>
+                <w:rFonts w:ascii="Consolas" w:hAnsi="Consolas"/>
+                <w:sz w:val="20"/>
+                <w:szCs w:val="20"/>
+              </w:rPr>
+              <w:t>SmartPark.Tests</w:t>
+            </w:r>
+            <w:proofErr w:type="spellEnd"/>
+          </w:p>
+          <w:p>
+            <w:pPr>
+              <w:rPr>
+                <w:rFonts w:ascii="Consolas" w:hAnsi="Consolas"/>
+                <w:sz w:val="20"/>
+                <w:szCs w:val="20"/>
+              </w:rPr>
+            </w:pPr>
+            <w:r>
+              <w:rPr>
+                <w:rFonts w:ascii="Consolas" w:hAnsi="Consolas"/>
+                <w:sz w:val="20"/>
+                <w:szCs w:val="20"/>
+              </w:rPr>
+              <w:t>[xUnit.net 00:00:00.20]   Discovered</w:t>
+            </w:r>
+            <w:proofErr w:type="gramStart"/>
+            <w:r>
+              <w:rPr>
+                <w:rFonts w:ascii="Consolas" w:hAnsi="Consolas"/>
+                <w:sz w:val="20"/>
+                <w:szCs w:val="20"/>
+              </w:rPr>
+              <w:t xml:space="preserve">:  </w:t>
+            </w:r>
+            <w:proofErr w:type="spellStart"/>
+            <w:r>
+              <w:rPr>
+                <w:rFonts w:ascii="Consolas" w:hAnsi="Consolas"/>
+                <w:sz w:val="20"/>
+                <w:szCs w:val="20"/>
+              </w:rPr>
+              <w:t>SmartPark</w:t>
+            </w:r>
+            <w:proofErr w:type="gramEnd"/>
+            <w:r>
+              <w:rPr>
+                <w:rFonts w:ascii="Consolas" w:hAnsi="Consolas"/>
+                <w:sz w:val="20"/>
+                <w:szCs w:val="20"/>
+              </w:rPr>
+              <w:t>.Tests</w:t>
+            </w:r>
+            <w:proofErr w:type="spellEnd"/>
+          </w:p>
+          <w:p>
+            <w:pPr>
+              <w:rPr>
+                <w:rFonts w:ascii="Consolas" w:hAnsi="Consolas"/>
+                <w:sz w:val="20"/>
+                <w:szCs w:val="20"/>
+              </w:rPr>
+            </w:pPr>
+            <w:r>
+              <w:rPr>
+                <w:rFonts w:ascii="Consolas" w:hAnsi="Consolas"/>
+                <w:sz w:val="20"/>
+                <w:szCs w:val="20"/>
+              </w:rPr>
+              <w:t xml:space="preserve">  </w:t>
+            </w:r>
+            <w:proofErr w:type="spellStart"/>
+            <w:r>
+              <w:rPr>
+                <w:rFonts w:ascii="Consolas" w:hAnsi="Consolas"/>
+                <w:sz w:val="20"/>
+                <w:szCs w:val="20"/>
+              </w:rPr>
+              <w:t>SmartPark.Tests</w:t>
+            </w:r>
+            <w:proofErr w:type="spellEnd"/>
+            <w:r>
+              <w:rPr>
+                <w:rFonts w:ascii="Consolas" w:hAnsi="Consolas"/>
+                <w:sz w:val="20"/>
+                <w:szCs w:val="20"/>
+              </w:rPr>
+              <w:t xml:space="preserve"> test net10.0 succeeded with 1 warning(s) (1.3s)</w:t>
+            </w:r>
+          </w:p>
+          <w:p>
+            <w:pPr>
+              <w:rPr>
+                <w:rFonts w:ascii="Consolas" w:hAnsi="Consolas"/>
+                <w:sz w:val="20"/>
+                <w:szCs w:val="20"/>
+              </w:rPr>
+            </w:pPr>
+            <w:r>
+              <w:rPr>
+                <w:rFonts w:ascii="Consolas" w:hAnsi="Consolas"/>
+                <w:sz w:val="20"/>
+                <w:szCs w:val="20"/>
+              </w:rPr>
+              <w:t xml:space="preserve">    C:\Program </w:t>
+            </w:r>
+            <w:proofErr w:type="gramStart"/>
+            <w:r>
+              <w:rPr>
+                <w:rFonts w:ascii="Consolas" w:hAnsi="Consolas"/>
+                <w:sz w:val="20"/>
+                <w:szCs w:val="20"/>
+              </w:rPr>
+              <w:t>Files\dotnet\</w:t>
+            </w:r>
+            <w:proofErr w:type="spellStart"/>
+            <w:r>
+              <w:rPr>
+                <w:rFonts w:ascii="Consolas" w:hAnsi="Consolas"/>
+                <w:sz w:val="20"/>
+                <w:szCs w:val="20"/>
+              </w:rPr>
+              <w:t>sdk</w:t>
+            </w:r>
+            <w:proofErr w:type="spellEnd"/>
+            <w:r>
+              <w:rPr>
+                <w:rFonts w:ascii="Consolas" w:hAnsi="Consolas"/>
+                <w:sz w:val="20"/>
+                <w:szCs w:val="20"/>
+              </w:rPr>
+              <w:t>\10.0.100\</w:t>
+            </w:r>
+            <w:proofErr w:type="spellStart"/>
+            <w:r>
+              <w:rPr>
+                <w:rFonts w:ascii="Consolas" w:hAnsi="Consolas"/>
+                <w:sz w:val="20"/>
+                <w:szCs w:val="20"/>
+              </w:rPr>
+              <w:t>Microsoft.TestPlatform.targets</w:t>
+            </w:r>
+            <w:proofErr w:type="spellEnd"/>
+            <w:r>
+              <w:rPr>
+                <w:rFonts w:ascii="Consolas" w:hAnsi="Consolas"/>
+                <w:sz w:val="20"/>
+                <w:szCs w:val="20"/>
+              </w:rPr>
+              <w:t>(</w:t>
+            </w:r>
+            <w:proofErr w:type="gramEnd"/>
+            <w:r>
+              <w:rPr>
+                <w:rFonts w:ascii="Consolas" w:hAnsi="Consolas"/>
+                <w:sz w:val="20"/>
+                <w:szCs w:val="20"/>
+              </w:rPr>
+              <w:t>48,5): warning No test matches the given testcase filter `Property` in D:\automate-test-ITE-E5-TangPiseth\automate-test-E5-TangPiseth\tests\SmartPark.Tests\bin\Debug\net10.0\SmartPark.Tests.dll</w:t>
+            </w:r>
+          </w:p>
+          <w:p>
+            <w:pPr>
+              <w:rPr>
+                <w:rFonts w:ascii="Consolas" w:hAnsi="Consolas"/>
+                <w:sz w:val="20"/>
+                <w:szCs w:val="20"/>
+              </w:rPr>
+            </w:pPr>
+          </w:p>
+          <w:p>
+            <w:pPr>
+              <w:rPr>
+                <w:rFonts w:ascii="Consolas" w:hAnsi="Consolas"/>
+                <w:sz w:val="20"/>
+                <w:szCs w:val="20"/>
+              </w:rPr>
+            </w:pPr>
+            <w:r>
+              <w:rPr>
+                <w:rFonts w:ascii="Consolas" w:hAnsi="Consolas"/>
+                <w:sz w:val="20"/>
+                <w:szCs w:val="20"/>
+              </w:rPr>
+              <w:t>Test summary: total: 0, failed: 0, succeeded: 0, skipped: 0, duration: 1.3s</w:t>
+            </w:r>
+          </w:p>
+          <w:p>
+            <w:pPr>
+              <w:rPr>
+                <w:rFonts w:ascii="Consolas" w:hAnsi="Consolas"/>
+                <w:sz w:val="20"/>
+                <w:szCs w:val="20"/>
+              </w:rPr>
+            </w:pPr>
+            <w:r>
+              <w:rPr>
+                <w:rFonts w:ascii="Consolas" w:hAnsi="Consolas"/>
+                <w:sz w:val="20"/>
+                <w:szCs w:val="20"/>
+              </w:rPr>
+              <w:t>Build succeeded with 1 warning(s) in 2.7s</w:t>
+            </w:r>
           </w:p>
         </w:tc>
       </w:tr>
@@ -7077,6 +8387,394 @@
                 <w:szCs w:val="22"/>
               </w:rPr>
             </w:pPr>
+            <w:r>
+              <w:rPr>
+                <w:rFonts w:ascii="Lora" w:hAnsi="Lora"/>
+                <w:szCs w:val="22"/>
+              </w:rPr>
+              <w:t>PS D:\automate-test-ITE-E5-TangPiseth\automate-test-E5-TangPiseth&gt; dotnet test --filter "</w:t>
+            </w:r>
+            <w:proofErr w:type="spellStart"/>
+            <w:r>
+              <w:rPr>
+                <w:rFonts w:ascii="Lora" w:hAnsi="Lora"/>
+                <w:szCs w:val="22"/>
+              </w:rPr>
+              <w:t>IntegrationTests</w:t>
+            </w:r>
+            <w:proofErr w:type="spellEnd"/>
+            <w:r>
+              <w:rPr>
+                <w:rFonts w:ascii="Lora" w:hAnsi="Lora"/>
+                <w:szCs w:val="22"/>
+              </w:rPr>
+              <w:t>"</w:t>
+            </w:r>
+          </w:p>
+          <w:p>
+            <w:pPr>
+              <w:rPr>
+                <w:rFonts w:ascii="Lora" w:hAnsi="Lora"/>
+                <w:szCs w:val="22"/>
+              </w:rPr>
+            </w:pPr>
+            <w:r>
+              <w:rPr>
+                <w:rFonts w:ascii="Lora" w:hAnsi="Lora"/>
+                <w:szCs w:val="22"/>
+              </w:rPr>
+              <w:t>Restore complete (0.9s)</w:t>
+            </w:r>
+          </w:p>
+          <w:p>
+            <w:pPr>
+              <w:rPr>
+                <w:rFonts w:ascii="Lora" w:hAnsi="Lora"/>
+                <w:szCs w:val="22"/>
+              </w:rPr>
+            </w:pPr>
+            <w:r>
+              <w:rPr>
+                <w:rFonts w:ascii="Lora" w:hAnsi="Lora"/>
+                <w:szCs w:val="22"/>
+              </w:rPr>
+              <w:t xml:space="preserve">  </w:t>
+            </w:r>
+            <w:proofErr w:type="spellStart"/>
+            <w:r>
+              <w:rPr>
+                <w:rFonts w:ascii="Lora" w:hAnsi="Lora"/>
+                <w:szCs w:val="22"/>
+              </w:rPr>
+              <w:t>SmartPark.Core</w:t>
+            </w:r>
+            <w:proofErr w:type="spellEnd"/>
+            <w:r>
+              <w:rPr>
+                <w:rFonts w:ascii="Lora" w:hAnsi="Lora"/>
+                <w:szCs w:val="22"/>
+              </w:rPr>
+              <w:t xml:space="preserve"> net10.0 succeeded (0.1s) </w:t>
+            </w:r>
+            <w:r>
+              <w:rPr>
+                <w:rFonts w:ascii="Times New Roman" w:hAnsi="Times New Roman" w:cs="Times New Roman"/>
+                <w:szCs w:val="22"/>
+              </w:rPr>
+              <w:t>→</w:t>
+            </w:r>
+            <w:r>
+              <w:rPr>
+                <w:rFonts w:ascii="Lora" w:hAnsi="Lora"/>
+                <w:szCs w:val="22"/>
+              </w:rPr>
+              <w:t xml:space="preserve"> </w:t>
+            </w:r>
+            <w:proofErr w:type="spellStart"/>
+            <w:r>
+              <w:rPr>
+                <w:rFonts w:ascii="Lora" w:hAnsi="Lora"/>
+                <w:szCs w:val="22"/>
+              </w:rPr>
+              <w:t>src</w:t>
+            </w:r>
+            <w:proofErr w:type="spellEnd"/>
+            <w:r>
+              <w:rPr>
+                <w:rFonts w:ascii="Lora" w:hAnsi="Lora"/>
+                <w:szCs w:val="22"/>
+              </w:rPr>
+              <w:t>\</w:t>
+            </w:r>
+            <w:proofErr w:type="spellStart"/>
+            <w:r>
+              <w:rPr>
+                <w:rFonts w:ascii="Lora" w:hAnsi="Lora"/>
+                <w:szCs w:val="22"/>
+              </w:rPr>
+              <w:t>SmartPark.Core</w:t>
+            </w:r>
+            <w:proofErr w:type="spellEnd"/>
+            <w:r>
+              <w:rPr>
+                <w:rFonts w:ascii="Lora" w:hAnsi="Lora"/>
+                <w:szCs w:val="22"/>
+              </w:rPr>
+              <w:t>\bin\Debug\net10.0\SmartPark.Core.dll</w:t>
+            </w:r>
+          </w:p>
+          <w:p>
+            <w:pPr>
+              <w:rPr>
+                <w:rFonts w:ascii="Lora" w:hAnsi="Lora"/>
+                <w:szCs w:val="22"/>
+              </w:rPr>
+            </w:pPr>
+            <w:r>
+              <w:rPr>
+                <w:rFonts w:ascii="Lora" w:hAnsi="Lora"/>
+                <w:szCs w:val="22"/>
+              </w:rPr>
+              <w:t xml:space="preserve">  </w:t>
+            </w:r>
+            <w:proofErr w:type="spellStart"/>
+            <w:r>
+              <w:rPr>
+                <w:rFonts w:ascii="Lora" w:hAnsi="Lora"/>
+                <w:szCs w:val="22"/>
+              </w:rPr>
+              <w:t>SmartPark.Tests</w:t>
+            </w:r>
+            <w:proofErr w:type="spellEnd"/>
+            <w:r>
+              <w:rPr>
+                <w:rFonts w:ascii="Lora" w:hAnsi="Lora"/>
+                <w:szCs w:val="22"/>
+              </w:rPr>
+              <w:t xml:space="preserve"> net10.0 succeeded (0.1s) </w:t>
+            </w:r>
+            <w:r>
+              <w:rPr>
+                <w:rFonts w:ascii="Times New Roman" w:hAnsi="Times New Roman" w:cs="Times New Roman"/>
+                <w:szCs w:val="22"/>
+              </w:rPr>
+              <w:t>→</w:t>
+            </w:r>
+            <w:r>
+              <w:rPr>
+                <w:rFonts w:ascii="Lora" w:hAnsi="Lora"/>
+                <w:szCs w:val="22"/>
+              </w:rPr>
+              <w:t xml:space="preserve"> tests\</w:t>
+            </w:r>
+            <w:proofErr w:type="spellStart"/>
+            <w:r>
+              <w:rPr>
+                <w:rFonts w:ascii="Lora" w:hAnsi="Lora"/>
+                <w:szCs w:val="22"/>
+              </w:rPr>
+              <w:t>SmartPark.Tests</w:t>
+            </w:r>
+            <w:proofErr w:type="spellEnd"/>
+            <w:r>
+              <w:rPr>
+                <w:rFonts w:ascii="Lora" w:hAnsi="Lora"/>
+                <w:szCs w:val="22"/>
+              </w:rPr>
+              <w:t>\bin\Debug\net10.0\SmartPark.Tests.dll</w:t>
+            </w:r>
+          </w:p>
+          <w:p>
+            <w:pPr>
+              <w:rPr>
+                <w:rFonts w:ascii="Lora" w:hAnsi="Lora"/>
+                <w:szCs w:val="22"/>
+              </w:rPr>
+            </w:pPr>
+            <w:r>
+              <w:rPr>
+                <w:rFonts w:ascii="Lora" w:hAnsi="Lora"/>
+                <w:szCs w:val="22"/>
+              </w:rPr>
+              <w:t xml:space="preserve">[xUnit.net 00:00:00.00] xUnit.net </w:t>
+            </w:r>
+            <w:proofErr w:type="spellStart"/>
+            <w:r>
+              <w:rPr>
+                <w:rFonts w:ascii="Lora" w:hAnsi="Lora"/>
+                <w:szCs w:val="22"/>
+              </w:rPr>
+              <w:t>VSTest</w:t>
+            </w:r>
+            <w:proofErr w:type="spellEnd"/>
+            <w:r>
+              <w:rPr>
+                <w:rFonts w:ascii="Lora" w:hAnsi="Lora"/>
+                <w:szCs w:val="22"/>
+              </w:rPr>
+              <w:t xml:space="preserve"> Adapter v3.1.4+50e68bbb8b (64-bit .NET 10.0.0)</w:t>
+            </w:r>
+          </w:p>
+          <w:p>
+            <w:pPr>
+              <w:rPr>
+                <w:rFonts w:ascii="Lora" w:hAnsi="Lora"/>
+                <w:szCs w:val="22"/>
+              </w:rPr>
+            </w:pPr>
+            <w:r>
+              <w:rPr>
+                <w:rFonts w:ascii="Lora" w:hAnsi="Lora"/>
+                <w:szCs w:val="22"/>
+              </w:rPr>
+              <w:t xml:space="preserve">[xUnit.net 00:00:00.10]   Discovering: </w:t>
+            </w:r>
+            <w:proofErr w:type="spellStart"/>
+            <w:r>
+              <w:rPr>
+                <w:rFonts w:ascii="Lora" w:hAnsi="Lora"/>
+                <w:szCs w:val="22"/>
+              </w:rPr>
+              <w:t>SmartPark.Tests</w:t>
+            </w:r>
+            <w:proofErr w:type="spellEnd"/>
+          </w:p>
+          <w:p>
+            <w:pPr>
+              <w:rPr>
+                <w:rFonts w:ascii="Lora" w:hAnsi="Lora"/>
+                <w:szCs w:val="22"/>
+              </w:rPr>
+            </w:pPr>
+            <w:r>
+              <w:rPr>
+                <w:rFonts w:ascii="Lora" w:hAnsi="Lora"/>
+                <w:szCs w:val="22"/>
+              </w:rPr>
+              <w:t>[xUnit.net 00:00:00.17]   Discovered</w:t>
+            </w:r>
+            <w:proofErr w:type="gramStart"/>
+            <w:r>
+              <w:rPr>
+                <w:rFonts w:ascii="Lora" w:hAnsi="Lora"/>
+                <w:szCs w:val="22"/>
+              </w:rPr>
+              <w:t xml:space="preserve">:  </w:t>
+            </w:r>
+            <w:proofErr w:type="spellStart"/>
+            <w:r>
+              <w:rPr>
+                <w:rFonts w:ascii="Lora" w:hAnsi="Lora"/>
+                <w:szCs w:val="22"/>
+              </w:rPr>
+              <w:t>SmartPark</w:t>
+            </w:r>
+            <w:proofErr w:type="gramEnd"/>
+            <w:r>
+              <w:rPr>
+                <w:rFonts w:ascii="Lora" w:hAnsi="Lora"/>
+                <w:szCs w:val="22"/>
+              </w:rPr>
+              <w:t>.Tests</w:t>
+            </w:r>
+            <w:proofErr w:type="spellEnd"/>
+          </w:p>
+          <w:p>
+            <w:pPr>
+              <w:rPr>
+                <w:rFonts w:ascii="Lora" w:hAnsi="Lora"/>
+                <w:szCs w:val="22"/>
+              </w:rPr>
+            </w:pPr>
+            <w:r>
+              <w:rPr>
+                <w:rFonts w:ascii="Lora" w:hAnsi="Lora"/>
+                <w:szCs w:val="22"/>
+              </w:rPr>
+              <w:t xml:space="preserve">[xUnit.net 00:00:00.20]   Starting:    </w:t>
+            </w:r>
+            <w:proofErr w:type="spellStart"/>
+            <w:r>
+              <w:rPr>
+                <w:rFonts w:ascii="Lora" w:hAnsi="Lora"/>
+                <w:szCs w:val="22"/>
+              </w:rPr>
+              <w:t>SmartPark.Tests</w:t>
+            </w:r>
+            <w:proofErr w:type="spellEnd"/>
+          </w:p>
+          <w:p>
+            <w:pPr>
+              <w:rPr>
+                <w:rFonts w:ascii="Lora" w:hAnsi="Lora"/>
+                <w:szCs w:val="22"/>
+              </w:rPr>
+            </w:pPr>
+            <w:r>
+              <w:rPr>
+                <w:rFonts w:ascii="Lora" w:hAnsi="Lora"/>
+                <w:szCs w:val="22"/>
+              </w:rPr>
+              <w:t xml:space="preserve">[xUnit.net 00:00:00.36]   Finished:    </w:t>
+            </w:r>
+            <w:proofErr w:type="spellStart"/>
+            <w:r>
+              <w:rPr>
+                <w:rFonts w:ascii="Lora" w:hAnsi="Lora"/>
+                <w:szCs w:val="22"/>
+              </w:rPr>
+              <w:t>SmartPark.Tests</w:t>
+            </w:r>
+            <w:proofErr w:type="spellEnd"/>
+          </w:p>
+          <w:p>
+            <w:pPr>
+              <w:rPr>
+                <w:rFonts w:ascii="Lora" w:hAnsi="Lora"/>
+                <w:szCs w:val="22"/>
+              </w:rPr>
+            </w:pPr>
+            <w:r>
+              <w:rPr>
+                <w:rFonts w:ascii="Lora" w:hAnsi="Lora"/>
+                <w:szCs w:val="22"/>
+              </w:rPr>
+              <w:t xml:space="preserve">  </w:t>
+            </w:r>
+            <w:proofErr w:type="spellStart"/>
+            <w:r>
+              <w:rPr>
+                <w:rFonts w:ascii="Lora" w:hAnsi="Lora"/>
+                <w:szCs w:val="22"/>
+              </w:rPr>
+              <w:t>SmartPark.Tests</w:t>
+            </w:r>
+            <w:proofErr w:type="spellEnd"/>
+            <w:r>
+              <w:rPr>
+                <w:rFonts w:ascii="Lora" w:hAnsi="Lora"/>
+                <w:szCs w:val="22"/>
+              </w:rPr>
+              <w:t xml:space="preserve"> test net10.0 succeeded (1.4s)</w:t>
+            </w:r>
+          </w:p>
+          <w:p>
+            <w:pPr>
+              <w:rPr>
+                <w:rFonts w:ascii="Lora" w:hAnsi="Lora"/>
+                <w:szCs w:val="22"/>
+              </w:rPr>
+            </w:pPr>
+          </w:p>
+          <w:p>
+            <w:pPr>
+              <w:rPr>
+                <w:rFonts w:ascii="Lora" w:hAnsi="Lora"/>
+                <w:szCs w:val="22"/>
+              </w:rPr>
+            </w:pPr>
+            <w:r>
+              <w:rPr>
+                <w:rFonts w:ascii="Lora" w:hAnsi="Lora"/>
+                <w:szCs w:val="22"/>
+              </w:rPr>
+              <w:t>Test summary: total: 1, failed: 0, succeeded: 1, skipped: 0, duration: 1.3s</w:t>
+            </w:r>
+          </w:p>
+          <w:p>
+            <w:pPr>
+              <w:rPr>
+                <w:rFonts w:ascii="Lora" w:hAnsi="Lora"/>
+                <w:szCs w:val="22"/>
+              </w:rPr>
+            </w:pPr>
+            <w:r>
+              <w:rPr>
+                <w:rFonts w:ascii="Lora" w:hAnsi="Lora"/>
+                <w:szCs w:val="22"/>
+              </w:rPr>
+              <w:t>Build succeeded in 2.8s</w:t>
+            </w:r>
           </w:p>
         </w:tc>
       </w:tr>
@@ -7301,6 +8999,18 @@
                 <w:szCs w:val="20"/>
               </w:rPr>
             </w:pPr>
+            <w:proofErr w:type="spellStart"/>
+            <w:r>
+              <w:rPr>
+                <w:rFonts w:ascii="Lora" w:hAnsi="Lora"/>
+                <w:b/>
+                <w:bCs/>
+                <w:sz w:val="20"/>
+                <w:szCs w:val="20"/>
+              </w:rPr>
+              <w:t>ParkingFeeCalculator</w:t>
+            </w:r>
+            <w:proofErr w:type="spellEnd"/>
           </w:p>
         </w:tc>
         <w:tc>
@@ -7315,6 +9025,13 @@
                 <w:szCs w:val="22"/>
               </w:rPr>
             </w:pPr>
+            <w:r>
+              <w:rPr>
+                <w:rFonts w:ascii="Lora" w:hAnsi="Lora"/>
+                <w:szCs w:val="22"/>
+              </w:rPr>
+              <w:t>76.9%</w:t>
+            </w:r>
           </w:p>
         </w:tc>
         <w:tc>
@@ -7329,6 +9046,13 @@
                 <w:szCs w:val="22"/>
               </w:rPr>
             </w:pPr>
+            <w:r>
+              <w:rPr>
+                <w:rFonts w:ascii="Lora" w:hAnsi="Lora"/>
+                <w:szCs w:val="22"/>
+              </w:rPr>
+              <w:t>88.2%</w:t>
+            </w:r>
           </w:p>
         </w:tc>
       </w:tr>
@@ -7352,6 +9076,18 @@
                 <w:szCs w:val="20"/>
               </w:rPr>
             </w:pPr>
+            <w:proofErr w:type="spellStart"/>
+            <w:r>
+              <w:rPr>
+                <w:rFonts w:ascii="Lora" w:hAnsi="Lora"/>
+                <w:b/>
+                <w:bCs/>
+                <w:sz w:val="20"/>
+                <w:szCs w:val="20"/>
+              </w:rPr>
+              <w:t>ParkingSessionManager</w:t>
+            </w:r>
+            <w:proofErr w:type="spellEnd"/>
           </w:p>
         </w:tc>
         <w:tc>
@@ -7366,6 +9102,13 @@
                 <w:szCs w:val="22"/>
               </w:rPr>
             </w:pPr>
+            <w:r>
+              <w:rPr>
+                <w:rFonts w:ascii="Lora" w:hAnsi="Lora"/>
+                <w:szCs w:val="22"/>
+              </w:rPr>
+              <w:t>88.5%</w:t>
+            </w:r>
           </w:p>
         </w:tc>
         <w:tc>
@@ -7380,6 +9123,13 @@
                 <w:szCs w:val="22"/>
               </w:rPr>
             </w:pPr>
+            <w:r>
+              <w:rPr>
+                <w:rFonts w:ascii="Lora" w:hAnsi="Lora"/>
+                <w:szCs w:val="22"/>
+              </w:rPr>
+              <w:t>50%</w:t>
+            </w:r>
           </w:p>
         </w:tc>
       </w:tr>
@@ -7403,6 +9153,16 @@
                 <w:szCs w:val="20"/>
               </w:rPr>
             </w:pPr>
+            <w:r>
+              <w:rPr>
+                <w:rFonts w:ascii="Lora" w:hAnsi="Lora"/>
+                <w:b/>
+                <w:bCs/>
+                <w:sz w:val="20"/>
+                <w:szCs w:val="20"/>
+              </w:rPr>
+              <w:t>Overall</w:t>
+            </w:r>
           </w:p>
         </w:tc>
         <w:tc>
@@ -7417,6 +9177,13 @@
                 <w:szCs w:val="22"/>
               </w:rPr>
             </w:pPr>
+            <w:r>
+              <w:rPr>
+                <w:rFonts w:ascii="Lora" w:hAnsi="Lora"/>
+                <w:szCs w:val="22"/>
+              </w:rPr>
+              <w:t>67.4%</w:t>
+            </w:r>
           </w:p>
         </w:tc>
         <w:tc>
@@ -7431,6 +9198,13 @@
                 <w:szCs w:val="22"/>
               </w:rPr>
             </w:pPr>
+            <w:r>
+              <w:rPr>
+                <w:rFonts w:ascii="Lora" w:hAnsi="Lora"/>
+                <w:szCs w:val="22"/>
+              </w:rPr>
+              <w:t>77.3%</w:t>
+            </w:r>
           </w:p>
         </w:tc>
       </w:tr>
@@ -7482,6 +9256,7 @@
           <w:rFonts w:ascii="Lora" w:hAnsi="Lora"/>
           <w:szCs w:val="22"/>
         </w:rPr>
+        <w:lastRenderedPageBreak/>
         <w:t xml:space="preserve">Finally, run ALL tests at once and paste the full output: </w:t>
       </w:r>
       <w:r>
@@ -7516,6 +9291,350 @@
                 <w:szCs w:val="22"/>
               </w:rPr>
             </w:pPr>
+            <w:r>
+              <w:rPr>
+                <w:rFonts w:ascii="Consolas" w:hAnsi="Consolas"/>
+                <w:szCs w:val="22"/>
+              </w:rPr>
+              <w:t>PS D:\automate-test-ITE-E5-TangPiseth\automate-test-E5-TangPiseth&gt; dotnet test</w:t>
+            </w:r>
+          </w:p>
+          <w:p>
+            <w:pPr>
+              <w:rPr>
+                <w:rFonts w:ascii="Consolas" w:hAnsi="Consolas"/>
+                <w:szCs w:val="22"/>
+              </w:rPr>
+            </w:pPr>
+            <w:r>
+              <w:rPr>
+                <w:rFonts w:ascii="Consolas" w:hAnsi="Consolas"/>
+                <w:szCs w:val="22"/>
+              </w:rPr>
+              <w:t>Restore complete (0.9s)</w:t>
+            </w:r>
+          </w:p>
+          <w:p>
+            <w:pPr>
+              <w:rPr>
+                <w:rFonts w:ascii="Consolas" w:hAnsi="Consolas"/>
+                <w:szCs w:val="22"/>
+              </w:rPr>
+            </w:pPr>
+            <w:r>
+              <w:rPr>
+                <w:rFonts w:ascii="Consolas" w:hAnsi="Consolas"/>
+                <w:szCs w:val="22"/>
+              </w:rPr>
+              <w:t xml:space="preserve">  </w:t>
+            </w:r>
+            <w:proofErr w:type="spellStart"/>
+            <w:r>
+              <w:rPr>
+                <w:rFonts w:ascii="Consolas" w:hAnsi="Consolas"/>
+                <w:szCs w:val="22"/>
+              </w:rPr>
+              <w:t>SmartPark.Core</w:t>
+            </w:r>
+            <w:proofErr w:type="spellEnd"/>
+            <w:r>
+              <w:rPr>
+                <w:rFonts w:ascii="Consolas" w:hAnsi="Consolas"/>
+                <w:szCs w:val="22"/>
+              </w:rPr>
+              <w:t xml:space="preserve"> net10.0 succeeded (0.1s) → </w:t>
+            </w:r>
+            <w:proofErr w:type="spellStart"/>
+            <w:r>
+              <w:rPr>
+                <w:rFonts w:ascii="Consolas" w:hAnsi="Consolas"/>
+                <w:szCs w:val="22"/>
+              </w:rPr>
+              <w:t>src</w:t>
+            </w:r>
+            <w:proofErr w:type="spellEnd"/>
+            <w:r>
+              <w:rPr>
+                <w:rFonts w:ascii="Consolas" w:hAnsi="Consolas"/>
+                <w:szCs w:val="22"/>
+              </w:rPr>
+              <w:t>\</w:t>
+            </w:r>
+            <w:proofErr w:type="spellStart"/>
+            <w:r>
+              <w:rPr>
+                <w:rFonts w:ascii="Consolas" w:hAnsi="Consolas"/>
+                <w:szCs w:val="22"/>
+              </w:rPr>
+              <w:t>SmartPark.Core</w:t>
+            </w:r>
+            <w:proofErr w:type="spellEnd"/>
+            <w:r>
+              <w:rPr>
+                <w:rFonts w:ascii="Consolas" w:hAnsi="Consolas"/>
+                <w:szCs w:val="22"/>
+              </w:rPr>
+              <w:t>\bin\Debug\net10.0\SmartPark.Core.dll</w:t>
+            </w:r>
+          </w:p>
+          <w:p>
+            <w:pPr>
+              <w:rPr>
+                <w:rFonts w:ascii="Consolas" w:hAnsi="Consolas"/>
+                <w:szCs w:val="22"/>
+              </w:rPr>
+            </w:pPr>
+            <w:r>
+              <w:rPr>
+                <w:rFonts w:ascii="Consolas" w:hAnsi="Consolas"/>
+                <w:szCs w:val="22"/>
+              </w:rPr>
+              <w:t xml:space="preserve">  </w:t>
+            </w:r>
+            <w:proofErr w:type="spellStart"/>
+            <w:r>
+              <w:rPr>
+                <w:rFonts w:ascii="Consolas" w:hAnsi="Consolas"/>
+                <w:szCs w:val="22"/>
+              </w:rPr>
+              <w:t>SmartPark.Tests</w:t>
+            </w:r>
+            <w:proofErr w:type="spellEnd"/>
+            <w:r>
+              <w:rPr>
+                <w:rFonts w:ascii="Consolas" w:hAnsi="Consolas"/>
+                <w:szCs w:val="22"/>
+              </w:rPr>
+              <w:t xml:space="preserve"> net10.0 succeeded (0.2s) → tests\</w:t>
+            </w:r>
+            <w:proofErr w:type="spellStart"/>
+            <w:r>
+              <w:rPr>
+                <w:rFonts w:ascii="Consolas" w:hAnsi="Consolas"/>
+                <w:szCs w:val="22"/>
+              </w:rPr>
+              <w:t>SmartPark.Tests</w:t>
+            </w:r>
+            <w:proofErr w:type="spellEnd"/>
+            <w:r>
+              <w:rPr>
+                <w:rFonts w:ascii="Consolas" w:hAnsi="Consolas"/>
+                <w:szCs w:val="22"/>
+              </w:rPr>
+              <w:t>\bin\Debug\net10.0\SmartPark.Tests.dll</w:t>
+            </w:r>
+          </w:p>
+          <w:p>
+            <w:pPr>
+              <w:rPr>
+                <w:rFonts w:ascii="Consolas" w:hAnsi="Consolas"/>
+                <w:szCs w:val="22"/>
+              </w:rPr>
+            </w:pPr>
+            <w:r>
+              <w:rPr>
+                <w:rFonts w:ascii="Consolas" w:hAnsi="Consolas"/>
+                <w:szCs w:val="22"/>
+              </w:rPr>
+              <w:t xml:space="preserve">[xUnit.net 00:00:00.00] xUnit.net </w:t>
+            </w:r>
+            <w:proofErr w:type="spellStart"/>
+            <w:r>
+              <w:rPr>
+                <w:rFonts w:ascii="Consolas" w:hAnsi="Consolas"/>
+                <w:szCs w:val="22"/>
+              </w:rPr>
+              <w:t>VSTest</w:t>
+            </w:r>
+            <w:proofErr w:type="spellEnd"/>
+            <w:r>
+              <w:rPr>
+                <w:rFonts w:ascii="Consolas" w:hAnsi="Consolas"/>
+                <w:szCs w:val="22"/>
+              </w:rPr>
+              <w:t xml:space="preserve"> Adapter v3.1.4+50e68bbb8b (64-bit .NET 10.0.0)</w:t>
+            </w:r>
+          </w:p>
+          <w:p>
+            <w:pPr>
+              <w:rPr>
+                <w:rFonts w:ascii="Consolas" w:hAnsi="Consolas"/>
+                <w:szCs w:val="22"/>
+              </w:rPr>
+            </w:pPr>
+            <w:r>
+              <w:rPr>
+                <w:rFonts w:ascii="Consolas" w:hAnsi="Consolas"/>
+                <w:szCs w:val="22"/>
+              </w:rPr>
+              <w:t xml:space="preserve">[xUnit.net 00:00:00.11]   Discovering: </w:t>
+            </w:r>
+            <w:proofErr w:type="spellStart"/>
+            <w:r>
+              <w:rPr>
+                <w:rFonts w:ascii="Consolas" w:hAnsi="Consolas"/>
+                <w:szCs w:val="22"/>
+              </w:rPr>
+              <w:t>SmartPark.Tests</w:t>
+            </w:r>
+            <w:proofErr w:type="spellEnd"/>
+          </w:p>
+          <w:p>
+            <w:pPr>
+              <w:rPr>
+                <w:rFonts w:ascii="Consolas" w:hAnsi="Consolas"/>
+                <w:szCs w:val="22"/>
+              </w:rPr>
+            </w:pPr>
+            <w:r>
+              <w:rPr>
+                <w:rFonts w:ascii="Consolas" w:hAnsi="Consolas"/>
+                <w:szCs w:val="22"/>
+              </w:rPr>
+              <w:t>[xUnit.net 00:00:00.18]   Discovered</w:t>
+            </w:r>
+            <w:proofErr w:type="gramStart"/>
+            <w:r>
+              <w:rPr>
+                <w:rFonts w:ascii="Consolas" w:hAnsi="Consolas"/>
+                <w:szCs w:val="22"/>
+              </w:rPr>
+              <w:t xml:space="preserve">:  </w:t>
+            </w:r>
+            <w:proofErr w:type="spellStart"/>
+            <w:r>
+              <w:rPr>
+                <w:rFonts w:ascii="Consolas" w:hAnsi="Consolas"/>
+                <w:szCs w:val="22"/>
+              </w:rPr>
+              <w:t>SmartPark</w:t>
+            </w:r>
+            <w:proofErr w:type="gramEnd"/>
+            <w:r>
+              <w:rPr>
+                <w:rFonts w:ascii="Consolas" w:hAnsi="Consolas"/>
+                <w:szCs w:val="22"/>
+              </w:rPr>
+              <w:t>.Tests</w:t>
+            </w:r>
+            <w:proofErr w:type="spellEnd"/>
+          </w:p>
+          <w:p>
+            <w:pPr>
+              <w:rPr>
+                <w:rFonts w:ascii="Consolas" w:hAnsi="Consolas"/>
+                <w:szCs w:val="22"/>
+              </w:rPr>
+            </w:pPr>
+            <w:r>
+              <w:rPr>
+                <w:rFonts w:ascii="Consolas" w:hAnsi="Consolas"/>
+                <w:szCs w:val="22"/>
+              </w:rPr>
+              <w:t xml:space="preserve">[xUnit.net 00:00:00.21]   Starting:    </w:t>
+            </w:r>
+            <w:proofErr w:type="spellStart"/>
+            <w:r>
+              <w:rPr>
+                <w:rFonts w:ascii="Consolas" w:hAnsi="Consolas"/>
+                <w:szCs w:val="22"/>
+              </w:rPr>
+              <w:t>SmartPark.Tests</w:t>
+            </w:r>
+            <w:proofErr w:type="spellEnd"/>
+          </w:p>
+          <w:p>
+            <w:pPr>
+              <w:rPr>
+                <w:rFonts w:ascii="Consolas" w:hAnsi="Consolas"/>
+                <w:szCs w:val="22"/>
+              </w:rPr>
+            </w:pPr>
+            <w:r>
+              <w:rPr>
+                <w:rFonts w:ascii="Consolas" w:hAnsi="Consolas"/>
+                <w:szCs w:val="22"/>
+              </w:rPr>
+              <w:t xml:space="preserve">[xUnit.net 00:00:00.34]   Finished:    </w:t>
+            </w:r>
+            <w:proofErr w:type="spellStart"/>
+            <w:r>
+              <w:rPr>
+                <w:rFonts w:ascii="Consolas" w:hAnsi="Consolas"/>
+                <w:szCs w:val="22"/>
+              </w:rPr>
+              <w:t>SmartPark.Tests</w:t>
+            </w:r>
+            <w:proofErr w:type="spellEnd"/>
+          </w:p>
+          <w:p>
+            <w:pPr>
+              <w:rPr>
+                <w:rFonts w:ascii="Consolas" w:hAnsi="Consolas"/>
+                <w:szCs w:val="22"/>
+              </w:rPr>
+            </w:pPr>
+            <w:r>
+              <w:rPr>
+                <w:rFonts w:ascii="Consolas" w:hAnsi="Consolas"/>
+                <w:szCs w:val="22"/>
+              </w:rPr>
+              <w:t xml:space="preserve">  </w:t>
+            </w:r>
+            <w:proofErr w:type="spellStart"/>
+            <w:r>
+              <w:rPr>
+                <w:rFonts w:ascii="Consolas" w:hAnsi="Consolas"/>
+                <w:szCs w:val="22"/>
+              </w:rPr>
+              <w:t>SmartPark.Tests</w:t>
+            </w:r>
+            <w:proofErr w:type="spellEnd"/>
+            <w:r>
+              <w:rPr>
+                <w:rFonts w:ascii="Consolas" w:hAnsi="Consolas"/>
+                <w:szCs w:val="22"/>
+              </w:rPr>
+              <w:t xml:space="preserve"> test net10.0 succeeded (1.3s)</w:t>
+            </w:r>
+          </w:p>
+          <w:p>
+            <w:pPr>
+              <w:rPr>
+                <w:rFonts w:ascii="Consolas" w:hAnsi="Consolas"/>
+                <w:szCs w:val="22"/>
+              </w:rPr>
+            </w:pPr>
+          </w:p>
+          <w:p>
+            <w:pPr>
+              <w:rPr>
+                <w:rFonts w:ascii="Consolas" w:hAnsi="Consolas"/>
+                <w:szCs w:val="22"/>
+              </w:rPr>
+            </w:pPr>
+            <w:r>
+              <w:rPr>
+                <w:rFonts w:ascii="Consolas" w:hAnsi="Consolas"/>
+                <w:szCs w:val="22"/>
+              </w:rPr>
+              <w:t>Test summary: total: 14, failed: 0, succeeded: 14, skipped: 0, duration: 1.3s</w:t>
+            </w:r>
+          </w:p>
+          <w:p>
+            <w:pPr>
+              <w:rPr>
+                <w:rFonts w:ascii="Consolas" w:hAnsi="Consolas"/>
+                <w:szCs w:val="22"/>
+              </w:rPr>
+            </w:pPr>
+            <w:r>
+              <w:rPr>
+                <w:rFonts w:ascii="Consolas" w:hAnsi="Consolas"/>
+                <w:szCs w:val="22"/>
+              </w:rPr>
+              <w:t>Build succeeded in 2.7s</w:t>
+            </w:r>
           </w:p>
         </w:tc>
       </w:tr>
@@ -7688,6 +9807,13 @@
                 <w:szCs w:val="22"/>
               </w:rPr>
             </w:pPr>
+            <w:r>
+              <w:rPr>
+                <w:rFonts w:ascii="Lora" w:hAnsi="Lora"/>
+                <w:szCs w:val="22"/>
+              </w:rPr>
+              <w:t>14</w:t>
+            </w:r>
           </w:p>
         </w:tc>
         <w:tc>
@@ -7702,6 +9828,13 @@
                 <w:szCs w:val="22"/>
               </w:rPr>
             </w:pPr>
+            <w:r>
+              <w:rPr>
+                <w:rFonts w:ascii="Lora" w:hAnsi="Lora"/>
+                <w:szCs w:val="22"/>
+              </w:rPr>
+              <w:t>14</w:t>
+            </w:r>
           </w:p>
         </w:tc>
         <w:tc>
@@ -7716,6 +9849,13 @@
                 <w:szCs w:val="22"/>
               </w:rPr>
             </w:pPr>
+            <w:r>
+              <w:rPr>
+                <w:rFonts w:ascii="Lora" w:hAnsi="Lora"/>
+                <w:szCs w:val="22"/>
+              </w:rPr>
+              <w:t>0</w:t>
+            </w:r>
           </w:p>
         </w:tc>
         <w:tc>
@@ -7730,6 +9870,13 @@
                 <w:szCs w:val="22"/>
               </w:rPr>
             </w:pPr>
+            <w:r>
+              <w:rPr>
+                <w:rFonts w:ascii="Lora" w:hAnsi="Lora"/>
+                <w:szCs w:val="22"/>
+              </w:rPr>
+              <w:t>0</w:t>
+            </w:r>
           </w:p>
         </w:tc>
       </w:tr>
@@ -7764,7 +9911,6 @@
           <w:szCs w:val="32"/>
           <w:u w:val="single"/>
         </w:rPr>
-        <w:lastRenderedPageBreak/>
         <w:t xml:space="preserve">Part 4: Traceability Matrix </w:t>
       </w:r>
     </w:p>
@@ -9775,6 +11921,36 @@
       <w:shd w:val="clear" w:color="auto" w:fill="E1DFDD"/>
     </w:rPr>
   </w:style>
+  <w:style w:type="paragraph" w:styleId="HTMLPreformatted">
+    <w:name w:val="HTML Preformatted"/>
+    <w:basedOn w:val="Normal"/>
+    <w:link w:val="HTMLPreformattedChar"/>
+    <w:uiPriority w:val="99"/>
+    <w:semiHidden/>
+    <w:unhideWhenUsed/>
+    <w:rsid w:val="00AB4084"/>
+    <w:pPr>
+      <w:spacing w:after="0" w:line="240" w:lineRule="auto"/>
+    </w:pPr>
+    <w:rPr>
+      <w:rFonts w:ascii="Consolas" w:hAnsi="Consolas"/>
+      <w:sz w:val="20"/>
+      <w:szCs w:val="32"/>
+    </w:rPr>
+  </w:style>
+  <w:style w:type="character" w:customStyle="1" w:styleId="HTMLPreformattedChar">
+    <w:name w:val="HTML Preformatted Char"/>
+    <w:basedOn w:val="DefaultParagraphFont"/>
+    <w:link w:val="HTMLPreformatted"/>
+    <w:uiPriority w:val="99"/>
+    <w:semiHidden/>
+    <w:rsid w:val="00AB4084"/>
+    <w:rPr>
+      <w:rFonts w:ascii="Consolas" w:hAnsi="Consolas"/>
+      <w:sz w:val="20"/>
+      <w:szCs w:val="32"/>
+    </w:rPr>
+  </w:style>
 </w:styles>
 </file>
 

</xml_diff>